<commit_message>
Prepare v0.18.0 release and update all formal manuals
</commit_message>
<xml_diff>
--- a/docs/manuals/00_ETIS_Engineering_Studio_Master_Manual_and_Documentation_Index.docx
+++ b/docs/manuals/00_ETIS_Engineering_Studio_Master_Manual_and_Documentation_Index.docx
@@ -20,6 +20,10 @@
         <w:pStyle w:val="Title"/>
       </w:pPr>
       <w:r>
+        <w:rPr>
+          <w:color w:val="000000"/>
+          <w:u w:val="none"/>
+        </w:rPr>
         <w:t>Master Manual &amp; Documentation Index</w:t>
       </w:r>
     </w:p>
@@ -29,6 +33,11 @@
       </w:pPr>
       <w:r>
         <w:t>Executive overview of the Engineering Studio, its place in ETIS, student and instructor use, installation, administration, production operations, CLI tooling, and recovery</w:t>
+      </w:r>
+    </w:p>
+    <w:p>
+      <w:r>
+        <w:t>v0.18.0 manual edition. Software release candidate; publication follows deployment acceptance.</w:t>
       </w:r>
     </w:p>
     <w:tbl>
@@ -42,6 +51,10 @@
         <w:gridCol w:w="5083"/>
       </w:tblGrid>
       <w:tr>
+        <w:trPr>
+          <w:tblHeader/>
+          <w:cantSplit/>
+        </w:trPr>
         <w:tc>
           <w:tcPr>
             <w:tcW w:type="dxa" w:w="5083"/>
@@ -54,6 +67,9 @@
             </w:tcMar>
           </w:tcPr>
           <w:p>
+            <w:pPr>
+              <w:keepNext w:val="0"/>
+            </w:pPr>
             <w:r>
               <w:rPr>
                 <w:b/>
@@ -73,6 +89,9 @@
             </w:tcMar>
           </w:tcPr>
           <w:p>
+            <w:pPr>
+              <w:keepNext w:val="0"/>
+            </w:pPr>
             <w:r>
               <w:t>Students, teaching staff, technical administrators, production operators, institutional adopters, and maintainers</w:t>
             </w:r>
@@ -80,6 +99,9 @@
         </w:tc>
       </w:tr>
       <w:tr>
+        <w:trPr>
+          <w:cantSplit/>
+        </w:trPr>
         <w:tc>
           <w:tcPr>
             <w:tcW w:type="dxa" w:w="5083"/>
@@ -92,6 +114,9 @@
             </w:tcMar>
           </w:tcPr>
           <w:p>
+            <w:pPr>
+              <w:keepNext w:val="0"/>
+            </w:pPr>
             <w:r>
               <w:rPr>
                 <w:b/>
@@ -111,6 +136,9 @@
             </w:tcMar>
           </w:tcPr>
           <w:p>
+            <w:pPr>
+              <w:keepNext w:val="0"/>
+            </w:pPr>
             <w:r>
               <w:t>Provide the front door to the complete ETIS Engineering Studio documentation library and explain how the product, people, evidence, and operating model fit together.</w:t>
             </w:r>
@@ -118,6 +146,9 @@
         </w:tc>
       </w:tr>
       <w:tr>
+        <w:trPr>
+          <w:cantSplit/>
+        </w:trPr>
         <w:tc>
           <w:tcPr>
             <w:tcW w:type="dxa" w:w="5083"/>
@@ -130,6 +161,9 @@
             </w:tcMar>
           </w:tcPr>
           <w:p>
+            <w:pPr>
+              <w:keepNext w:val="0"/>
+            </w:pPr>
             <w:r>
               <w:rPr>
                 <w:b/>
@@ -149,6 +183,9 @@
             </w:tcMar>
           </w:tcPr>
           <w:p>
+            <w:pPr>
+              <w:keepNext w:val="0"/>
+            </w:pPr>
             <w:r>
               <w:t>COMP 330/474 Software Engineering • Fall 2026</w:t>
             </w:r>
@@ -156,6 +193,9 @@
         </w:tc>
       </w:tr>
       <w:tr>
+        <w:trPr>
+          <w:cantSplit/>
+        </w:trPr>
         <w:tc>
           <w:tcPr>
             <w:tcW w:type="dxa" w:w="5083"/>
@@ -168,6 +208,9 @@
             </w:tcMar>
           </w:tcPr>
           <w:p>
+            <w:pPr>
+              <w:keepNext w:val="0"/>
+            </w:pPr>
             <w:r>
               <w:rPr>
                 <w:b/>
@@ -187,8 +230,11 @@
             </w:tcMar>
           </w:tcPr>
           <w:p>
-            <w:r>
-              <w:t>Semester Start 2026 • August 23, 2026</w:t>
+            <w:pPr>
+              <w:keepNext w:val="0"/>
+            </w:pPr>
+            <w:r>
+              <w:t>v0.18.0 • October 2, 2026</w:t>
             </w:r>
           </w:p>
         </w:tc>
@@ -205,6 +251,10 @@
         <w:gridCol w:w="10166"/>
       </w:tblGrid>
       <w:tr>
+        <w:trPr>
+          <w:tblHeader/>
+          <w:cantSplit/>
+        </w:trPr>
         <w:tc>
           <w:tcPr>
             <w:tcW w:type="dxa" w:w="10166"/>
@@ -217,6 +267,9 @@
             </w:tcMar>
           </w:tcPr>
           <w:p>
+            <w:pPr>
+              <w:keepNext w:val="0"/>
+            </w:pPr>
             <w:r>
               <w:rPr>
                 <w:b/>
@@ -354,6 +407,10 @@
         <w:gridCol w:w="10166"/>
       </w:tblGrid>
       <w:tr>
+        <w:trPr>
+          <w:tblHeader/>
+          <w:cantSplit/>
+        </w:trPr>
         <w:tc>
           <w:tcPr>
             <w:tcW w:type="dxa" w:w="10166"/>
@@ -366,6 +423,9 @@
             </w:tcMar>
           </w:tcPr>
           <w:p>
+            <w:pPr>
+              <w:keepNext w:val="0"/>
+            </w:pPr>
             <w:r>
               <w:rPr>
                 <w:b/>
@@ -415,6 +475,7 @@
     </w:p>
     <w:p>
       <w:pPr>
+        <w:keepNext/>
         <w:jc w:val="center"/>
       </w:pPr>
       <w:r>
@@ -455,10 +516,15 @@
     <w:p>
       <w:pPr>
         <w:pStyle w:val="ETISCaption"/>
+        <w:keepNext w:val="0"/>
+        <w:keepLines/>
         <w:jc w:val="center"/>
       </w:pPr>
       <w:r>
         <w:t>Figure 1. ETIS ecosystem and the role of Engineering Studio. Studio is connected to the Framework and Platform, but it has a distinct developmental-review purpose.</w:t>
+      </w:r>
+      <w:r>
+        <w:t xml:space="preserve"> Historical reference figure; current text governs.</w:t>
       </w:r>
     </w:p>
     <w:tbl>
@@ -471,6 +537,10 @@
         <w:gridCol w:w="10166"/>
       </w:tblGrid>
       <w:tr>
+        <w:trPr>
+          <w:tblHeader/>
+          <w:cantSplit/>
+        </w:trPr>
         <w:tc>
           <w:tcPr>
             <w:tcW w:type="dxa" w:w="10166"/>
@@ -483,6 +553,9 @@
             </w:tcMar>
           </w:tcPr>
           <w:p>
+            <w:pPr>
+              <w:keepNext w:val="0"/>
+            </w:pPr>
             <w:r>
               <w:rPr>
                 <w:b/>
@@ -534,6 +607,8 @@
       <w:tr>
         <w:trPr>
           <w:tblHeader w:val="true"/>
+          <w:tblHeader/>
+          <w:cantSplit/>
         </w:trPr>
         <w:tc>
           <w:tcPr>
@@ -547,6 +622,9 @@
             </w:tcMar>
           </w:tcPr>
           <w:p>
+            <w:pPr>
+              <w:keepNext w:val="0"/>
+            </w:pPr>
             <w:r>
               <w:rPr>
                 <w:b/>
@@ -569,6 +647,9 @@
             </w:tcMar>
           </w:tcPr>
           <w:p>
+            <w:pPr>
+              <w:keepNext w:val="0"/>
+            </w:pPr>
             <w:r>
               <w:rPr>
                 <w:b/>
@@ -595,6 +676,9 @@
             </w:tcMar>
           </w:tcPr>
           <w:p>
+            <w:pPr>
+              <w:keepNext w:val="0"/>
+            </w:pPr>
             <w:r>
               <w:rPr>
                 <w:sz w:val="18"/>
@@ -614,6 +698,9 @@
             </w:tcMar>
           </w:tcPr>
           <w:p>
+            <w:pPr>
+              <w:keepNext w:val="0"/>
+            </w:pPr>
             <w:r>
               <w:rPr>
                 <w:sz w:val="18"/>
@@ -638,6 +725,9 @@
             </w:tcMar>
           </w:tcPr>
           <w:p>
+            <w:pPr>
+              <w:keepNext w:val="0"/>
+            </w:pPr>
             <w:r>
               <w:rPr>
                 <w:sz w:val="18"/>
@@ -657,6 +747,9 @@
             </w:tcMar>
           </w:tcPr>
           <w:p>
+            <w:pPr>
+              <w:keepNext w:val="0"/>
+            </w:pPr>
             <w:r>
               <w:rPr>
                 <w:sz w:val="18"/>
@@ -681,6 +774,9 @@
             </w:tcMar>
           </w:tcPr>
           <w:p>
+            <w:pPr>
+              <w:keepNext w:val="0"/>
+            </w:pPr>
             <w:r>
               <w:rPr>
                 <w:sz w:val="18"/>
@@ -700,6 +796,9 @@
             </w:tcMar>
           </w:tcPr>
           <w:p>
+            <w:pPr>
+              <w:keepNext w:val="0"/>
+            </w:pPr>
             <w:r>
               <w:rPr>
                 <w:sz w:val="18"/>
@@ -724,6 +823,9 @@
             </w:tcMar>
           </w:tcPr>
           <w:p>
+            <w:pPr>
+              <w:keepNext w:val="0"/>
+            </w:pPr>
             <w:r>
               <w:rPr>
                 <w:sz w:val="18"/>
@@ -743,6 +845,9 @@
             </w:tcMar>
           </w:tcPr>
           <w:p>
+            <w:pPr>
+              <w:keepNext w:val="0"/>
+            </w:pPr>
             <w:r>
               <w:rPr>
                 <w:sz w:val="18"/>
@@ -767,6 +872,9 @@
             </w:tcMar>
           </w:tcPr>
           <w:p>
+            <w:pPr>
+              <w:keepNext w:val="0"/>
+            </w:pPr>
             <w:r>
               <w:rPr>
                 <w:sz w:val="18"/>
@@ -786,6 +894,9 @@
             </w:tcMar>
           </w:tcPr>
           <w:p>
+            <w:pPr>
+              <w:keepNext w:val="0"/>
+            </w:pPr>
             <w:r>
               <w:rPr>
                 <w:sz w:val="18"/>
@@ -874,6 +985,8 @@
       <w:tr>
         <w:trPr>
           <w:tblHeader w:val="true"/>
+          <w:tblHeader/>
+          <w:cantSplit/>
         </w:trPr>
         <w:tc>
           <w:tcPr>
@@ -887,6 +1000,9 @@
             </w:tcMar>
           </w:tcPr>
           <w:p>
+            <w:pPr>
+              <w:keepNext w:val="0"/>
+            </w:pPr>
             <w:r>
               <w:rPr>
                 <w:b/>
@@ -909,6 +1025,9 @@
             </w:tcMar>
           </w:tcPr>
           <w:p>
+            <w:pPr>
+              <w:keepNext w:val="0"/>
+            </w:pPr>
             <w:r>
               <w:rPr>
                 <w:b/>
@@ -931,6 +1050,9 @@
             </w:tcMar>
           </w:tcPr>
           <w:p>
+            <w:pPr>
+              <w:keepNext w:val="0"/>
+            </w:pPr>
             <w:r>
               <w:rPr>
                 <w:b/>
@@ -957,6 +1079,9 @@
             </w:tcMar>
           </w:tcPr>
           <w:p>
+            <w:pPr>
+              <w:keepNext w:val="0"/>
+            </w:pPr>
             <w:r>
               <w:rPr>
                 <w:sz w:val="18"/>
@@ -976,6 +1101,9 @@
             </w:tcMar>
           </w:tcPr>
           <w:p>
+            <w:pPr>
+              <w:keepNext w:val="0"/>
+            </w:pPr>
             <w:r>
               <w:rPr>
                 <w:sz w:val="18"/>
@@ -995,6 +1123,9 @@
             </w:tcMar>
           </w:tcPr>
           <w:p>
+            <w:pPr>
+              <w:keepNext w:val="0"/>
+            </w:pPr>
             <w:r>
               <w:rPr>
                 <w:sz w:val="18"/>
@@ -1019,6 +1150,9 @@
             </w:tcMar>
           </w:tcPr>
           <w:p>
+            <w:pPr>
+              <w:keepNext w:val="0"/>
+            </w:pPr>
             <w:r>
               <w:rPr>
                 <w:sz w:val="18"/>
@@ -1038,6 +1172,9 @@
             </w:tcMar>
           </w:tcPr>
           <w:p>
+            <w:pPr>
+              <w:keepNext w:val="0"/>
+            </w:pPr>
             <w:r>
               <w:rPr>
                 <w:sz w:val="18"/>
@@ -1057,6 +1194,9 @@
             </w:tcMar>
           </w:tcPr>
           <w:p>
+            <w:pPr>
+              <w:keepNext w:val="0"/>
+            </w:pPr>
             <w:r>
               <w:rPr>
                 <w:sz w:val="18"/>
@@ -1081,6 +1221,9 @@
             </w:tcMar>
           </w:tcPr>
           <w:p>
+            <w:pPr>
+              <w:keepNext w:val="0"/>
+            </w:pPr>
             <w:r>
               <w:rPr>
                 <w:sz w:val="18"/>
@@ -1100,6 +1243,9 @@
             </w:tcMar>
           </w:tcPr>
           <w:p>
+            <w:pPr>
+              <w:keepNext w:val="0"/>
+            </w:pPr>
             <w:r>
               <w:rPr>
                 <w:sz w:val="18"/>
@@ -1119,6 +1265,9 @@
             </w:tcMar>
           </w:tcPr>
           <w:p>
+            <w:pPr>
+              <w:keepNext w:val="0"/>
+            </w:pPr>
             <w:r>
               <w:rPr>
                 <w:sz w:val="18"/>
@@ -1143,6 +1292,9 @@
             </w:tcMar>
           </w:tcPr>
           <w:p>
+            <w:pPr>
+              <w:keepNext w:val="0"/>
+            </w:pPr>
             <w:r>
               <w:rPr>
                 <w:sz w:val="18"/>
@@ -1162,6 +1314,9 @@
             </w:tcMar>
           </w:tcPr>
           <w:p>
+            <w:pPr>
+              <w:keepNext w:val="0"/>
+            </w:pPr>
             <w:r>
               <w:rPr>
                 <w:sz w:val="18"/>
@@ -1181,6 +1336,9 @@
             </w:tcMar>
           </w:tcPr>
           <w:p>
+            <w:pPr>
+              <w:keepNext w:val="0"/>
+            </w:pPr>
             <w:r>
               <w:rPr>
                 <w:sz w:val="18"/>
@@ -1205,6 +1363,9 @@
             </w:tcMar>
           </w:tcPr>
           <w:p>
+            <w:pPr>
+              <w:keepNext w:val="0"/>
+            </w:pPr>
             <w:r>
               <w:rPr>
                 <w:sz w:val="18"/>
@@ -1224,6 +1385,9 @@
             </w:tcMar>
           </w:tcPr>
           <w:p>
+            <w:pPr>
+              <w:keepNext w:val="0"/>
+            </w:pPr>
             <w:r>
               <w:rPr>
                 <w:sz w:val="18"/>
@@ -1243,6 +1407,9 @@
             </w:tcMar>
           </w:tcPr>
           <w:p>
+            <w:pPr>
+              <w:keepNext w:val="0"/>
+            </w:pPr>
             <w:r>
               <w:rPr>
                 <w:sz w:val="18"/>
@@ -1267,6 +1434,9 @@
             </w:tcMar>
           </w:tcPr>
           <w:p>
+            <w:pPr>
+              <w:keepNext w:val="0"/>
+            </w:pPr>
             <w:r>
               <w:rPr>
                 <w:sz w:val="18"/>
@@ -1286,6 +1456,9 @@
             </w:tcMar>
           </w:tcPr>
           <w:p>
+            <w:pPr>
+              <w:keepNext w:val="0"/>
+            </w:pPr>
             <w:r>
               <w:rPr>
                 <w:sz w:val="18"/>
@@ -1305,6 +1478,9 @@
             </w:tcMar>
           </w:tcPr>
           <w:p>
+            <w:pPr>
+              <w:keepNext w:val="0"/>
+            </w:pPr>
             <w:r>
               <w:rPr>
                 <w:sz w:val="18"/>
@@ -1329,6 +1505,9 @@
             </w:tcMar>
           </w:tcPr>
           <w:p>
+            <w:pPr>
+              <w:keepNext w:val="0"/>
+            </w:pPr>
             <w:r>
               <w:rPr>
                 <w:sz w:val="18"/>
@@ -1348,6 +1527,9 @@
             </w:tcMar>
           </w:tcPr>
           <w:p>
+            <w:pPr>
+              <w:keepNext w:val="0"/>
+            </w:pPr>
             <w:r>
               <w:rPr>
                 <w:sz w:val="18"/>
@@ -1367,6 +1549,9 @@
             </w:tcMar>
           </w:tcPr>
           <w:p>
+            <w:pPr>
+              <w:keepNext w:val="0"/>
+            </w:pPr>
             <w:r>
               <w:rPr>
                 <w:sz w:val="18"/>
@@ -1391,6 +1576,9 @@
             </w:tcMar>
           </w:tcPr>
           <w:p>
+            <w:pPr>
+              <w:keepNext w:val="0"/>
+            </w:pPr>
             <w:r>
               <w:rPr>
                 <w:sz w:val="18"/>
@@ -1410,6 +1598,9 @@
             </w:tcMar>
           </w:tcPr>
           <w:p>
+            <w:pPr>
+              <w:keepNext w:val="0"/>
+            </w:pPr>
             <w:r>
               <w:rPr>
                 <w:sz w:val="18"/>
@@ -1429,6 +1620,9 @@
             </w:tcMar>
           </w:tcPr>
           <w:p>
+            <w:pPr>
+              <w:keepNext w:val="0"/>
+            </w:pPr>
             <w:r>
               <w:rPr>
                 <w:sz w:val="18"/>
@@ -1454,6 +1648,10 @@
         <w:gridCol w:w="10166"/>
       </w:tblGrid>
       <w:tr>
+        <w:trPr>
+          <w:tblHeader/>
+          <w:cantSplit/>
+        </w:trPr>
         <w:tc>
           <w:tcPr>
             <w:tcW w:type="dxa" w:w="10166"/>
@@ -1466,6 +1664,9 @@
             </w:tcMar>
           </w:tcPr>
           <w:p>
+            <w:pPr>
+              <w:keepNext w:val="0"/>
+            </w:pPr>
             <w:r>
               <w:rPr>
                 <w:b/>
@@ -1500,6 +1701,7 @@
     </w:p>
     <w:p>
       <w:pPr>
+        <w:keepNext/>
         <w:jc w:val="center"/>
       </w:pPr>
       <w:r>
@@ -1540,10 +1742,15 @@
     <w:p>
       <w:pPr>
         <w:pStyle w:val="ETISCaption"/>
+        <w:keepNext w:val="0"/>
+        <w:keepLines/>
         <w:jc w:val="center"/>
       </w:pPr>
       <w:r>
         <w:t>Figure 2. The three suite capabilities deliberately separate readiness, developmental review, and formal review.</w:t>
+      </w:r>
+      <w:r>
+        <w:t xml:space="preserve"> Historical reference figure; current text governs.</w:t>
       </w:r>
     </w:p>
     <w:p>
@@ -1553,6 +1760,7 @@
     </w:p>
     <w:p>
       <w:pPr>
+        <w:keepNext/>
         <w:jc w:val="center"/>
       </w:pPr>
       <w:r>
@@ -1593,10 +1801,15 @@
     <w:p>
       <w:pPr>
         <w:pStyle w:val="ETISCaption"/>
+        <w:keepNext w:val="0"/>
+        <w:keepLines/>
         <w:jc w:val="center"/>
       </w:pPr>
       <w:r>
         <w:t>Figure 3. Typical student evidence-and-review loop. A formal tag is created only after the evidence is ready to stand on its own.</w:t>
+      </w:r>
+      <w:r>
+        <w:t xml:space="preserve"> Historical reference figure; current text governs.</w:t>
       </w:r>
     </w:p>
     <w:p>
@@ -1627,6 +1840,8 @@
       <w:tr>
         <w:trPr>
           <w:tblHeader w:val="true"/>
+          <w:tblHeader/>
+          <w:cantSplit/>
         </w:trPr>
         <w:tc>
           <w:tcPr>
@@ -1640,6 +1855,9 @@
             </w:tcMar>
           </w:tcPr>
           <w:p>
+            <w:pPr>
+              <w:keepNext w:val="0"/>
+            </w:pPr>
             <w:r>
               <w:rPr>
                 <w:b/>
@@ -1662,6 +1880,9 @@
             </w:tcMar>
           </w:tcPr>
           <w:p>
+            <w:pPr>
+              <w:keepNext w:val="0"/>
+            </w:pPr>
             <w:r>
               <w:rPr>
                 <w:b/>
@@ -1684,6 +1905,9 @@
             </w:tcMar>
           </w:tcPr>
           <w:p>
+            <w:pPr>
+              <w:keepNext w:val="0"/>
+            </w:pPr>
             <w:r>
               <w:rPr>
                 <w:b/>
@@ -1710,6 +1934,9 @@
             </w:tcMar>
           </w:tcPr>
           <w:p>
+            <w:pPr>
+              <w:keepNext w:val="0"/>
+            </w:pPr>
             <w:r>
               <w:rPr>
                 <w:sz w:val="18"/>
@@ -1729,6 +1956,9 @@
             </w:tcMar>
           </w:tcPr>
           <w:p>
+            <w:pPr>
+              <w:keepNext w:val="0"/>
+            </w:pPr>
             <w:r>
               <w:rPr>
                 <w:sz w:val="18"/>
@@ -1748,6 +1978,9 @@
             </w:tcMar>
           </w:tcPr>
           <w:p>
+            <w:pPr>
+              <w:keepNext w:val="0"/>
+            </w:pPr>
             <w:r>
               <w:rPr>
                 <w:sz w:val="18"/>
@@ -1772,6 +2005,9 @@
             </w:tcMar>
           </w:tcPr>
           <w:p>
+            <w:pPr>
+              <w:keepNext w:val="0"/>
+            </w:pPr>
             <w:r>
               <w:rPr>
                 <w:sz w:val="18"/>
@@ -1791,6 +2027,9 @@
             </w:tcMar>
           </w:tcPr>
           <w:p>
+            <w:pPr>
+              <w:keepNext w:val="0"/>
+            </w:pPr>
             <w:r>
               <w:rPr>
                 <w:sz w:val="18"/>
@@ -1810,6 +2049,9 @@
             </w:tcMar>
           </w:tcPr>
           <w:p>
+            <w:pPr>
+              <w:keepNext w:val="0"/>
+            </w:pPr>
             <w:r>
               <w:rPr>
                 <w:sz w:val="18"/>
@@ -1834,6 +2076,9 @@
             </w:tcMar>
           </w:tcPr>
           <w:p>
+            <w:pPr>
+              <w:keepNext w:val="0"/>
+            </w:pPr>
             <w:r>
               <w:rPr>
                 <w:sz w:val="18"/>
@@ -1853,6 +2098,9 @@
             </w:tcMar>
           </w:tcPr>
           <w:p>
+            <w:pPr>
+              <w:keepNext w:val="0"/>
+            </w:pPr>
             <w:r>
               <w:rPr>
                 <w:sz w:val="18"/>
@@ -1872,6 +2120,9 @@
             </w:tcMar>
           </w:tcPr>
           <w:p>
+            <w:pPr>
+              <w:keepNext w:val="0"/>
+            </w:pPr>
             <w:r>
               <w:rPr>
                 <w:sz w:val="18"/>
@@ -1896,6 +2147,9 @@
             </w:tcMar>
           </w:tcPr>
           <w:p>
+            <w:pPr>
+              <w:keepNext w:val="0"/>
+            </w:pPr>
             <w:r>
               <w:rPr>
                 <w:sz w:val="18"/>
@@ -1915,6 +2169,9 @@
             </w:tcMar>
           </w:tcPr>
           <w:p>
+            <w:pPr>
+              <w:keepNext w:val="0"/>
+            </w:pPr>
             <w:r>
               <w:rPr>
                 <w:sz w:val="18"/>
@@ -1934,6 +2191,9 @@
             </w:tcMar>
           </w:tcPr>
           <w:p>
+            <w:pPr>
+              <w:keepNext w:val="0"/>
+            </w:pPr>
             <w:r>
               <w:rPr>
                 <w:sz w:val="18"/>
@@ -1958,6 +2218,9 @@
             </w:tcMar>
           </w:tcPr>
           <w:p>
+            <w:pPr>
+              <w:keepNext w:val="0"/>
+            </w:pPr>
             <w:r>
               <w:rPr>
                 <w:sz w:val="18"/>
@@ -1977,6 +2240,9 @@
             </w:tcMar>
           </w:tcPr>
           <w:p>
+            <w:pPr>
+              <w:keepNext w:val="0"/>
+            </w:pPr>
             <w:r>
               <w:rPr>
                 <w:sz w:val="18"/>
@@ -1996,6 +2262,9 @@
             </w:tcMar>
           </w:tcPr>
           <w:p>
+            <w:pPr>
+              <w:keepNext w:val="0"/>
+            </w:pPr>
             <w:r>
               <w:rPr>
                 <w:sz w:val="18"/>
@@ -2020,6 +2289,9 @@
             </w:tcMar>
           </w:tcPr>
           <w:p>
+            <w:pPr>
+              <w:keepNext w:val="0"/>
+            </w:pPr>
             <w:r>
               <w:rPr>
                 <w:sz w:val="18"/>
@@ -2039,6 +2311,9 @@
             </w:tcMar>
           </w:tcPr>
           <w:p>
+            <w:pPr>
+              <w:keepNext w:val="0"/>
+            </w:pPr>
             <w:r>
               <w:rPr>
                 <w:sz w:val="18"/>
@@ -2058,6 +2333,9 @@
             </w:tcMar>
           </w:tcPr>
           <w:p>
+            <w:pPr>
+              <w:keepNext w:val="0"/>
+            </w:pPr>
             <w:r>
               <w:rPr>
                 <w:sz w:val="18"/>
@@ -2082,6 +2360,9 @@
             </w:tcMar>
           </w:tcPr>
           <w:p>
+            <w:pPr>
+              <w:keepNext w:val="0"/>
+            </w:pPr>
             <w:r>
               <w:rPr>
                 <w:sz w:val="18"/>
@@ -2101,6 +2382,9 @@
             </w:tcMar>
           </w:tcPr>
           <w:p>
+            <w:pPr>
+              <w:keepNext w:val="0"/>
+            </w:pPr>
             <w:r>
               <w:rPr>
                 <w:sz w:val="18"/>
@@ -2120,6 +2404,9 @@
             </w:tcMar>
           </w:tcPr>
           <w:p>
+            <w:pPr>
+              <w:keepNext w:val="0"/>
+            </w:pPr>
             <w:r>
               <w:rPr>
                 <w:sz w:val="18"/>
@@ -2145,6 +2432,10 @@
         <w:gridCol w:w="10166"/>
       </w:tblGrid>
       <w:tr>
+        <w:trPr>
+          <w:tblHeader/>
+          <w:cantSplit/>
+        </w:trPr>
         <w:tc>
           <w:tcPr>
             <w:tcW w:type="dxa" w:w="10166"/>
@@ -2157,6 +2448,9 @@
             </w:tcMar>
           </w:tcPr>
           <w:p>
+            <w:pPr>
+              <w:keepNext w:val="0"/>
+            </w:pPr>
             <w:r>
               <w:rPr>
                 <w:b/>
@@ -2180,6 +2474,39 @@
       <w:pPr>
         <w:spacing w:after="20"/>
       </w:pPr>
+    </w:p>
+    <w:p>
+      <w:pPr>
+        <w:pStyle w:val="Heading2"/>
+      </w:pPr>
+      <w:r>
+        <w:t>Current review and evidence workflow</w:t>
+      </w:r>
+    </w:p>
+    <w:p>
+      <w:r>
+        <w:t>The Review Room is the conversation home. Engineering Evidence is the saved source notebook. Same-snapshot and newer-saved-snapshot notices explain their relationship; browsing newer saved evidence never changes an active review’s frozen baseline.</w:t>
+      </w:r>
+    </w:p>
+    <w:p>
+      <w:r>
+        <w:t>Inspect cited source opens the attached frozen artifact. Find supporting evidence searches the frozen snapshot for equivalent evidence; it is bounded and not exhaustive. Discuss helps you understand, Challenge tests an interpretation, and Help me resolve this coaches next work. An absent source must not be replaced by a guessed file link.</w:t>
+      </w:r>
+    </w:p>
+    <w:p>
+      <w:r>
+        <w:t>Only authoritative corrected or resolved findings are closed. Confirmed, evidence disputed, accepted risk and deferred findings remain open. Inspecting, searching, recommending and completing a review do not close a finding; work after the snapshot cannot close it on that earlier snapshot.</w:t>
+      </w:r>
+    </w:p>
+    <w:p>
+      <w:r>
+        <w:t>Button-triggered instructions are recorded as review actions, not as words the student wrote. Unsent drafts are preserved and remain private. Optional review context and other concerns stay secondary to the current concern and conversation.</w:t>
+      </w:r>
+    </w:p>
+    <w:p>
+      <w:r>
+        <w:t>In Help, artifact, challenge and exit dialogs, Tab and Shift+Tab stay within the dialog, Escape dismisses through the existing close action, and focus returns to a usable opener. Escape does not finish a review. Closing a pending challenge does not cancel its submitted request.</w:t>
+      </w:r>
     </w:p>
     <w:p>
       <w:pPr>
@@ -2209,6 +2536,8 @@
       <w:tr>
         <w:trPr>
           <w:tblHeader w:val="true"/>
+          <w:tblHeader/>
+          <w:cantSplit/>
         </w:trPr>
         <w:tc>
           <w:tcPr>
@@ -2222,6 +2551,9 @@
             </w:tcMar>
           </w:tcPr>
           <w:p>
+            <w:pPr>
+              <w:keepNext w:val="0"/>
+            </w:pPr>
             <w:r>
               <w:rPr>
                 <w:b/>
@@ -2244,6 +2576,9 @@
             </w:tcMar>
           </w:tcPr>
           <w:p>
+            <w:pPr>
+              <w:keepNext w:val="0"/>
+            </w:pPr>
             <w:r>
               <w:rPr>
                 <w:b/>
@@ -2266,6 +2601,9 @@
             </w:tcMar>
           </w:tcPr>
           <w:p>
+            <w:pPr>
+              <w:keepNext w:val="0"/>
+            </w:pPr>
             <w:r>
               <w:rPr>
                 <w:b/>
@@ -2292,6 +2630,9 @@
             </w:tcMar>
           </w:tcPr>
           <w:p>
+            <w:pPr>
+              <w:keepNext w:val="0"/>
+            </w:pPr>
             <w:r>
               <w:rPr>
                 <w:sz w:val="18"/>
@@ -2311,6 +2652,9 @@
             </w:tcMar>
           </w:tcPr>
           <w:p>
+            <w:pPr>
+              <w:keepNext w:val="0"/>
+            </w:pPr>
             <w:r>
               <w:rPr>
                 <w:sz w:val="18"/>
@@ -2330,6 +2674,9 @@
             </w:tcMar>
           </w:tcPr>
           <w:p>
+            <w:pPr>
+              <w:keepNext w:val="0"/>
+            </w:pPr>
             <w:r>
               <w:rPr>
                 <w:sz w:val="18"/>
@@ -2354,6 +2701,9 @@
             </w:tcMar>
           </w:tcPr>
           <w:p>
+            <w:pPr>
+              <w:keepNext w:val="0"/>
+            </w:pPr>
             <w:r>
               <w:rPr>
                 <w:sz w:val="18"/>
@@ -2373,6 +2723,9 @@
             </w:tcMar>
           </w:tcPr>
           <w:p>
+            <w:pPr>
+              <w:keepNext w:val="0"/>
+            </w:pPr>
             <w:r>
               <w:rPr>
                 <w:sz w:val="18"/>
@@ -2392,6 +2745,9 @@
             </w:tcMar>
           </w:tcPr>
           <w:p>
+            <w:pPr>
+              <w:keepNext w:val="0"/>
+            </w:pPr>
             <w:r>
               <w:rPr>
                 <w:sz w:val="18"/>
@@ -2416,6 +2772,9 @@
             </w:tcMar>
           </w:tcPr>
           <w:p>
+            <w:pPr>
+              <w:keepNext w:val="0"/>
+            </w:pPr>
             <w:r>
               <w:rPr>
                 <w:sz w:val="18"/>
@@ -2435,6 +2794,9 @@
             </w:tcMar>
           </w:tcPr>
           <w:p>
+            <w:pPr>
+              <w:keepNext w:val="0"/>
+            </w:pPr>
             <w:r>
               <w:rPr>
                 <w:sz w:val="18"/>
@@ -2454,6 +2816,9 @@
             </w:tcMar>
           </w:tcPr>
           <w:p>
+            <w:pPr>
+              <w:keepNext w:val="0"/>
+            </w:pPr>
             <w:r>
               <w:rPr>
                 <w:sz w:val="18"/>
@@ -2478,6 +2843,9 @@
             </w:tcMar>
           </w:tcPr>
           <w:p>
+            <w:pPr>
+              <w:keepNext w:val="0"/>
+            </w:pPr>
             <w:r>
               <w:rPr>
                 <w:sz w:val="18"/>
@@ -2497,6 +2865,9 @@
             </w:tcMar>
           </w:tcPr>
           <w:p>
+            <w:pPr>
+              <w:keepNext w:val="0"/>
+            </w:pPr>
             <w:r>
               <w:rPr>
                 <w:sz w:val="18"/>
@@ -2516,6 +2887,9 @@
             </w:tcMar>
           </w:tcPr>
           <w:p>
+            <w:pPr>
+              <w:keepNext w:val="0"/>
+            </w:pPr>
             <w:r>
               <w:rPr>
                 <w:sz w:val="18"/>
@@ -2540,6 +2914,9 @@
             </w:tcMar>
           </w:tcPr>
           <w:p>
+            <w:pPr>
+              <w:keepNext w:val="0"/>
+            </w:pPr>
             <w:r>
               <w:rPr>
                 <w:sz w:val="18"/>
@@ -2559,6 +2936,9 @@
             </w:tcMar>
           </w:tcPr>
           <w:p>
+            <w:pPr>
+              <w:keepNext w:val="0"/>
+            </w:pPr>
             <w:r>
               <w:rPr>
                 <w:sz w:val="18"/>
@@ -2578,6 +2958,9 @@
             </w:tcMar>
           </w:tcPr>
           <w:p>
+            <w:pPr>
+              <w:keepNext w:val="0"/>
+            </w:pPr>
             <w:r>
               <w:rPr>
                 <w:sz w:val="18"/>
@@ -2602,6 +2985,9 @@
             </w:tcMar>
           </w:tcPr>
           <w:p>
+            <w:pPr>
+              <w:keepNext w:val="0"/>
+            </w:pPr>
             <w:r>
               <w:rPr>
                 <w:sz w:val="18"/>
@@ -2621,6 +3007,9 @@
             </w:tcMar>
           </w:tcPr>
           <w:p>
+            <w:pPr>
+              <w:keepNext w:val="0"/>
+            </w:pPr>
             <w:r>
               <w:rPr>
                 <w:sz w:val="18"/>
@@ -2640,6 +3029,9 @@
             </w:tcMar>
           </w:tcPr>
           <w:p>
+            <w:pPr>
+              <w:keepNext w:val="0"/>
+            </w:pPr>
             <w:r>
               <w:rPr>
                 <w:sz w:val="18"/>
@@ -2664,6 +3056,9 @@
             </w:tcMar>
           </w:tcPr>
           <w:p>
+            <w:pPr>
+              <w:keepNext w:val="0"/>
+            </w:pPr>
             <w:r>
               <w:rPr>
                 <w:sz w:val="18"/>
@@ -2683,6 +3078,9 @@
             </w:tcMar>
           </w:tcPr>
           <w:p>
+            <w:pPr>
+              <w:keepNext w:val="0"/>
+            </w:pPr>
             <w:r>
               <w:rPr>
                 <w:sz w:val="18"/>
@@ -2702,6 +3100,9 @@
             </w:tcMar>
           </w:tcPr>
           <w:p>
+            <w:pPr>
+              <w:keepNext w:val="0"/>
+            </w:pPr>
             <w:r>
               <w:rPr>
                 <w:sz w:val="18"/>
@@ -2865,6 +3266,10 @@
         <w:gridCol w:w="10166"/>
       </w:tblGrid>
       <w:tr>
+        <w:trPr>
+          <w:tblHeader/>
+          <w:cantSplit/>
+        </w:trPr>
         <w:tc>
           <w:tcPr>
             <w:tcW w:type="dxa" w:w="10166"/>
@@ -2877,6 +3282,9 @@
             </w:tcMar>
           </w:tcPr>
           <w:p>
+            <w:pPr>
+              <w:keepNext w:val="0"/>
+            </w:pPr>
             <w:r>
               <w:rPr>
                 <w:b/>
@@ -2929,6 +3337,8 @@
       <w:tr>
         <w:trPr>
           <w:tblHeader w:val="true"/>
+          <w:tblHeader/>
+          <w:cantSplit/>
         </w:trPr>
         <w:tc>
           <w:tcPr>
@@ -2942,6 +3352,9 @@
             </w:tcMar>
           </w:tcPr>
           <w:p>
+            <w:pPr>
+              <w:keepNext w:val="0"/>
+            </w:pPr>
             <w:r>
               <w:rPr>
                 <w:b/>
@@ -2964,6 +3377,9 @@
             </w:tcMar>
           </w:tcPr>
           <w:p>
+            <w:pPr>
+              <w:keepNext w:val="0"/>
+            </w:pPr>
             <w:r>
               <w:rPr>
                 <w:b/>
@@ -2986,6 +3402,9 @@
             </w:tcMar>
           </w:tcPr>
           <w:p>
+            <w:pPr>
+              <w:keepNext w:val="0"/>
+            </w:pPr>
             <w:r>
               <w:rPr>
                 <w:b/>
@@ -3012,6 +3431,9 @@
             </w:tcMar>
           </w:tcPr>
           <w:p>
+            <w:pPr>
+              <w:keepNext w:val="0"/>
+            </w:pPr>
             <w:r>
               <w:rPr>
                 <w:sz w:val="18"/>
@@ -3031,6 +3453,9 @@
             </w:tcMar>
           </w:tcPr>
           <w:p>
+            <w:pPr>
+              <w:keepNext w:val="0"/>
+            </w:pPr>
             <w:r>
               <w:rPr>
                 <w:sz w:val="18"/>
@@ -3050,6 +3475,9 @@
             </w:tcMar>
           </w:tcPr>
           <w:p>
+            <w:pPr>
+              <w:keepNext w:val="0"/>
+            </w:pPr>
             <w:r>
               <w:rPr>
                 <w:sz w:val="18"/>
@@ -3074,6 +3502,9 @@
             </w:tcMar>
           </w:tcPr>
           <w:p>
+            <w:pPr>
+              <w:keepNext w:val="0"/>
+            </w:pPr>
             <w:r>
               <w:rPr>
                 <w:sz w:val="18"/>
@@ -3093,6 +3524,9 @@
             </w:tcMar>
           </w:tcPr>
           <w:p>
+            <w:pPr>
+              <w:keepNext w:val="0"/>
+            </w:pPr>
             <w:r>
               <w:rPr>
                 <w:sz w:val="18"/>
@@ -3112,6 +3546,9 @@
             </w:tcMar>
           </w:tcPr>
           <w:p>
+            <w:pPr>
+              <w:keepNext w:val="0"/>
+            </w:pPr>
             <w:r>
               <w:rPr>
                 <w:sz w:val="18"/>
@@ -3136,6 +3573,9 @@
             </w:tcMar>
           </w:tcPr>
           <w:p>
+            <w:pPr>
+              <w:keepNext w:val="0"/>
+            </w:pPr>
             <w:r>
               <w:rPr>
                 <w:sz w:val="18"/>
@@ -3155,6 +3595,9 @@
             </w:tcMar>
           </w:tcPr>
           <w:p>
+            <w:pPr>
+              <w:keepNext w:val="0"/>
+            </w:pPr>
             <w:r>
               <w:rPr>
                 <w:sz w:val="18"/>
@@ -3174,6 +3617,9 @@
             </w:tcMar>
           </w:tcPr>
           <w:p>
+            <w:pPr>
+              <w:keepNext w:val="0"/>
+            </w:pPr>
             <w:r>
               <w:rPr>
                 <w:sz w:val="18"/>
@@ -3198,6 +3644,9 @@
             </w:tcMar>
           </w:tcPr>
           <w:p>
+            <w:pPr>
+              <w:keepNext w:val="0"/>
+            </w:pPr>
             <w:r>
               <w:rPr>
                 <w:sz w:val="18"/>
@@ -3217,6 +3666,9 @@
             </w:tcMar>
           </w:tcPr>
           <w:p>
+            <w:pPr>
+              <w:keepNext w:val="0"/>
+            </w:pPr>
             <w:r>
               <w:rPr>
                 <w:sz w:val="18"/>
@@ -3236,6 +3688,9 @@
             </w:tcMar>
           </w:tcPr>
           <w:p>
+            <w:pPr>
+              <w:keepNext w:val="0"/>
+            </w:pPr>
             <w:r>
               <w:rPr>
                 <w:sz w:val="18"/>
@@ -3260,6 +3715,9 @@
             </w:tcMar>
           </w:tcPr>
           <w:p>
+            <w:pPr>
+              <w:keepNext w:val="0"/>
+            </w:pPr>
             <w:r>
               <w:rPr>
                 <w:sz w:val="18"/>
@@ -3279,6 +3737,9 @@
             </w:tcMar>
           </w:tcPr>
           <w:p>
+            <w:pPr>
+              <w:keepNext w:val="0"/>
+            </w:pPr>
             <w:r>
               <w:rPr>
                 <w:sz w:val="18"/>
@@ -3298,6 +3759,9 @@
             </w:tcMar>
           </w:tcPr>
           <w:p>
+            <w:pPr>
+              <w:keepNext w:val="0"/>
+            </w:pPr>
             <w:r>
               <w:rPr>
                 <w:sz w:val="18"/>
@@ -3322,6 +3786,9 @@
             </w:tcMar>
           </w:tcPr>
           <w:p>
+            <w:pPr>
+              <w:keepNext w:val="0"/>
+            </w:pPr>
             <w:r>
               <w:rPr>
                 <w:sz w:val="18"/>
@@ -3341,6 +3808,9 @@
             </w:tcMar>
           </w:tcPr>
           <w:p>
+            <w:pPr>
+              <w:keepNext w:val="0"/>
+            </w:pPr>
             <w:r>
               <w:rPr>
                 <w:sz w:val="18"/>
@@ -3360,6 +3830,9 @@
             </w:tcMar>
           </w:tcPr>
           <w:p>
+            <w:pPr>
+              <w:keepNext w:val="0"/>
+            </w:pPr>
             <w:r>
               <w:rPr>
                 <w:sz w:val="18"/>
@@ -3384,6 +3857,9 @@
             </w:tcMar>
           </w:tcPr>
           <w:p>
+            <w:pPr>
+              <w:keepNext w:val="0"/>
+            </w:pPr>
             <w:r>
               <w:rPr>
                 <w:sz w:val="18"/>
@@ -3403,6 +3879,9 @@
             </w:tcMar>
           </w:tcPr>
           <w:p>
+            <w:pPr>
+              <w:keepNext w:val="0"/>
+            </w:pPr>
             <w:r>
               <w:rPr>
                 <w:sz w:val="18"/>
@@ -3422,6 +3901,9 @@
             </w:tcMar>
           </w:tcPr>
           <w:p>
+            <w:pPr>
+              <w:keepNext w:val="0"/>
+            </w:pPr>
             <w:r>
               <w:rPr>
                 <w:sz w:val="18"/>
@@ -3446,6 +3928,9 @@
             </w:tcMar>
           </w:tcPr>
           <w:p>
+            <w:pPr>
+              <w:keepNext w:val="0"/>
+            </w:pPr>
             <w:r>
               <w:rPr>
                 <w:sz w:val="18"/>
@@ -3465,6 +3950,9 @@
             </w:tcMar>
           </w:tcPr>
           <w:p>
+            <w:pPr>
+              <w:keepNext w:val="0"/>
+            </w:pPr>
             <w:r>
               <w:rPr>
                 <w:sz w:val="18"/>
@@ -3484,6 +3972,9 @@
             </w:tcMar>
           </w:tcPr>
           <w:p>
+            <w:pPr>
+              <w:keepNext w:val="0"/>
+            </w:pPr>
             <w:r>
               <w:rPr>
                 <w:sz w:val="18"/>
@@ -3514,6 +4005,7 @@
     </w:p>
     <w:p>
       <w:pPr>
+        <w:keepNext/>
         <w:jc w:val="center"/>
       </w:pPr>
       <w:r>
@@ -3554,10 +4046,15 @@
     <w:p>
       <w:pPr>
         <w:pStyle w:val="ETISCaption"/>
+        <w:keepNext w:val="0"/>
+        <w:keepLines/>
         <w:jc w:val="center"/>
       </w:pPr>
       <w:r>
         <w:t>Figure 4. Production responsibility stack. Installation establishes the system; operations and recovery preserve it over time.</w:t>
+      </w:r>
+      <w:r>
+        <w:t xml:space="preserve"> Historical reference figure; current text governs.</w:t>
       </w:r>
     </w:p>
     <w:p>
@@ -3579,6 +4076,8 @@
       <w:tr>
         <w:trPr>
           <w:tblHeader w:val="true"/>
+          <w:tblHeader/>
+          <w:cantSplit/>
         </w:trPr>
         <w:tc>
           <w:tcPr>
@@ -3592,6 +4091,9 @@
             </w:tcMar>
           </w:tcPr>
           <w:p>
+            <w:pPr>
+              <w:keepNext w:val="0"/>
+            </w:pPr>
             <w:r>
               <w:rPr>
                 <w:b/>
@@ -3614,6 +4116,9 @@
             </w:tcMar>
           </w:tcPr>
           <w:p>
+            <w:pPr>
+              <w:keepNext w:val="0"/>
+            </w:pPr>
             <w:r>
               <w:rPr>
                 <w:b/>
@@ -3640,6 +4145,9 @@
             </w:tcMar>
           </w:tcPr>
           <w:p>
+            <w:pPr>
+              <w:keepNext w:val="0"/>
+            </w:pPr>
             <w:r>
               <w:rPr>
                 <w:sz w:val="18"/>
@@ -3659,6 +4167,9 @@
             </w:tcMar>
           </w:tcPr>
           <w:p>
+            <w:pPr>
+              <w:keepNext w:val="0"/>
+            </w:pPr>
             <w:r>
               <w:rPr>
                 <w:sz w:val="18"/>
@@ -3683,6 +4194,9 @@
             </w:tcMar>
           </w:tcPr>
           <w:p>
+            <w:pPr>
+              <w:keepNext w:val="0"/>
+            </w:pPr>
             <w:r>
               <w:rPr>
                 <w:sz w:val="18"/>
@@ -3702,6 +4216,9 @@
             </w:tcMar>
           </w:tcPr>
           <w:p>
+            <w:pPr>
+              <w:keepNext w:val="0"/>
+            </w:pPr>
             <w:r>
               <w:rPr>
                 <w:sz w:val="18"/>
@@ -3726,6 +4243,9 @@
             </w:tcMar>
           </w:tcPr>
           <w:p>
+            <w:pPr>
+              <w:keepNext w:val="0"/>
+            </w:pPr>
             <w:r>
               <w:rPr>
                 <w:sz w:val="18"/>
@@ -3745,6 +4265,9 @@
             </w:tcMar>
           </w:tcPr>
           <w:p>
+            <w:pPr>
+              <w:keepNext w:val="0"/>
+            </w:pPr>
             <w:r>
               <w:rPr>
                 <w:sz w:val="18"/>
@@ -3769,6 +4292,9 @@
             </w:tcMar>
           </w:tcPr>
           <w:p>
+            <w:pPr>
+              <w:keepNext w:val="0"/>
+            </w:pPr>
             <w:r>
               <w:rPr>
                 <w:sz w:val="18"/>
@@ -3788,6 +4314,9 @@
             </w:tcMar>
           </w:tcPr>
           <w:p>
+            <w:pPr>
+              <w:keepNext w:val="0"/>
+            </w:pPr>
             <w:r>
               <w:rPr>
                 <w:sz w:val="18"/>
@@ -3812,6 +4341,9 @@
             </w:tcMar>
           </w:tcPr>
           <w:p>
+            <w:pPr>
+              <w:keepNext w:val="0"/>
+            </w:pPr>
             <w:r>
               <w:rPr>
                 <w:sz w:val="18"/>
@@ -3831,6 +4363,9 @@
             </w:tcMar>
           </w:tcPr>
           <w:p>
+            <w:pPr>
+              <w:keepNext w:val="0"/>
+            </w:pPr>
             <w:r>
               <w:rPr>
                 <w:sz w:val="18"/>
@@ -3855,6 +4390,9 @@
             </w:tcMar>
           </w:tcPr>
           <w:p>
+            <w:pPr>
+              <w:keepNext w:val="0"/>
+            </w:pPr>
             <w:r>
               <w:rPr>
                 <w:sz w:val="18"/>
@@ -3874,6 +4412,9 @@
             </w:tcMar>
           </w:tcPr>
           <w:p>
+            <w:pPr>
+              <w:keepNext w:val="0"/>
+            </w:pPr>
             <w:r>
               <w:rPr>
                 <w:sz w:val="18"/>
@@ -3898,6 +4439,9 @@
             </w:tcMar>
           </w:tcPr>
           <w:p>
+            <w:pPr>
+              <w:keepNext w:val="0"/>
+            </w:pPr>
             <w:r>
               <w:rPr>
                 <w:sz w:val="18"/>
@@ -3917,6 +4461,9 @@
             </w:tcMar>
           </w:tcPr>
           <w:p>
+            <w:pPr>
+              <w:keepNext w:val="0"/>
+            </w:pPr>
             <w:r>
               <w:rPr>
                 <w:sz w:val="18"/>
@@ -3941,6 +4488,9 @@
             </w:tcMar>
           </w:tcPr>
           <w:p>
+            <w:pPr>
+              <w:keepNext w:val="0"/>
+            </w:pPr>
             <w:r>
               <w:rPr>
                 <w:sz w:val="18"/>
@@ -3960,6 +4510,9 @@
             </w:tcMar>
           </w:tcPr>
           <w:p>
+            <w:pPr>
+              <w:keepNext w:val="0"/>
+            </w:pPr>
             <w:r>
               <w:rPr>
                 <w:sz w:val="18"/>
@@ -3984,6 +4537,9 @@
             </w:tcMar>
           </w:tcPr>
           <w:p>
+            <w:pPr>
+              <w:keepNext w:val="0"/>
+            </w:pPr>
             <w:r>
               <w:rPr>
                 <w:sz w:val="18"/>
@@ -4003,6 +4559,9 @@
             </w:tcMar>
           </w:tcPr>
           <w:p>
+            <w:pPr>
+              <w:keepNext w:val="0"/>
+            </w:pPr>
             <w:r>
               <w:rPr>
                 <w:sz w:val="18"/>
@@ -4027,6 +4586,9 @@
             </w:tcMar>
           </w:tcPr>
           <w:p>
+            <w:pPr>
+              <w:keepNext w:val="0"/>
+            </w:pPr>
             <w:r>
               <w:rPr>
                 <w:sz w:val="18"/>
@@ -4046,6 +4608,9 @@
             </w:tcMar>
           </w:tcPr>
           <w:p>
+            <w:pPr>
+              <w:keepNext w:val="0"/>
+            </w:pPr>
             <w:r>
               <w:rPr>
                 <w:sz w:val="18"/>
@@ -4070,6 +4635,9 @@
             </w:tcMar>
           </w:tcPr>
           <w:p>
+            <w:pPr>
+              <w:keepNext w:val="0"/>
+            </w:pPr>
             <w:r>
               <w:rPr>
                 <w:sz w:val="18"/>
@@ -4089,6 +4657,9 @@
             </w:tcMar>
           </w:tcPr>
           <w:p>
+            <w:pPr>
+              <w:keepNext w:val="0"/>
+            </w:pPr>
             <w:r>
               <w:rPr>
                 <w:sz w:val="18"/>
@@ -4113,6 +4684,9 @@
             </w:tcMar>
           </w:tcPr>
           <w:p>
+            <w:pPr>
+              <w:keepNext w:val="0"/>
+            </w:pPr>
             <w:r>
               <w:rPr>
                 <w:sz w:val="18"/>
@@ -4132,6 +4706,9 @@
             </w:tcMar>
           </w:tcPr>
           <w:p>
+            <w:pPr>
+              <w:keepNext w:val="0"/>
+            </w:pPr>
             <w:r>
               <w:rPr>
                 <w:sz w:val="18"/>
@@ -4156,6 +4733,9 @@
             </w:tcMar>
           </w:tcPr>
           <w:p>
+            <w:pPr>
+              <w:keepNext w:val="0"/>
+            </w:pPr>
             <w:r>
               <w:rPr>
                 <w:sz w:val="18"/>
@@ -4175,6 +4755,9 @@
             </w:tcMar>
           </w:tcPr>
           <w:p>
+            <w:pPr>
+              <w:keepNext w:val="0"/>
+            </w:pPr>
             <w:r>
               <w:rPr>
                 <w:sz w:val="18"/>
@@ -4200,6 +4783,10 @@
         <w:gridCol w:w="10166"/>
       </w:tblGrid>
       <w:tr>
+        <w:trPr>
+          <w:tblHeader/>
+          <w:cantSplit/>
+        </w:trPr>
         <w:tc>
           <w:tcPr>
             <w:tcW w:type="dxa" w:w="10166"/>
@@ -4212,6 +4799,9 @@
             </w:tcMar>
           </w:tcPr>
           <w:p>
+            <w:pPr>
+              <w:keepNext w:val="0"/>
+            </w:pPr>
             <w:r>
               <w:rPr>
                 <w:b/>
@@ -4264,6 +4854,8 @@
       <w:tr>
         <w:trPr>
           <w:tblHeader w:val="true"/>
+          <w:tblHeader/>
+          <w:cantSplit/>
         </w:trPr>
         <w:tc>
           <w:tcPr>
@@ -4277,6 +4869,9 @@
             </w:tcMar>
           </w:tcPr>
           <w:p>
+            <w:pPr>
+              <w:keepNext w:val="0"/>
+            </w:pPr>
             <w:r>
               <w:rPr>
                 <w:b/>
@@ -4299,6 +4894,9 @@
             </w:tcMar>
           </w:tcPr>
           <w:p>
+            <w:pPr>
+              <w:keepNext w:val="0"/>
+            </w:pPr>
             <w:r>
               <w:rPr>
                 <w:b/>
@@ -4321,6 +4919,9 @@
             </w:tcMar>
           </w:tcPr>
           <w:p>
+            <w:pPr>
+              <w:keepNext w:val="0"/>
+            </w:pPr>
             <w:r>
               <w:rPr>
                 <w:b/>
@@ -4347,6 +4948,9 @@
             </w:tcMar>
           </w:tcPr>
           <w:p>
+            <w:pPr>
+              <w:keepNext w:val="0"/>
+            </w:pPr>
             <w:r>
               <w:rPr>
                 <w:sz w:val="18"/>
@@ -4366,6 +4970,9 @@
             </w:tcMar>
           </w:tcPr>
           <w:p>
+            <w:pPr>
+              <w:keepNext w:val="0"/>
+            </w:pPr>
             <w:r>
               <w:rPr>
                 <w:sz w:val="18"/>
@@ -4385,6 +4992,9 @@
             </w:tcMar>
           </w:tcPr>
           <w:p>
+            <w:pPr>
+              <w:keepNext w:val="0"/>
+            </w:pPr>
             <w:r>
               <w:rPr>
                 <w:sz w:val="18"/>
@@ -4409,6 +5019,9 @@
             </w:tcMar>
           </w:tcPr>
           <w:p>
+            <w:pPr>
+              <w:keepNext w:val="0"/>
+            </w:pPr>
             <w:r>
               <w:rPr>
                 <w:sz w:val="18"/>
@@ -4428,6 +5041,9 @@
             </w:tcMar>
           </w:tcPr>
           <w:p>
+            <w:pPr>
+              <w:keepNext w:val="0"/>
+            </w:pPr>
             <w:r>
               <w:rPr>
                 <w:sz w:val="18"/>
@@ -4447,6 +5063,9 @@
             </w:tcMar>
           </w:tcPr>
           <w:p>
+            <w:pPr>
+              <w:keepNext w:val="0"/>
+            </w:pPr>
             <w:r>
               <w:rPr>
                 <w:sz w:val="18"/>
@@ -4471,6 +5090,9 @@
             </w:tcMar>
           </w:tcPr>
           <w:p>
+            <w:pPr>
+              <w:keepNext w:val="0"/>
+            </w:pPr>
             <w:r>
               <w:rPr>
                 <w:sz w:val="18"/>
@@ -4490,6 +5112,9 @@
             </w:tcMar>
           </w:tcPr>
           <w:p>
+            <w:pPr>
+              <w:keepNext w:val="0"/>
+            </w:pPr>
             <w:r>
               <w:rPr>
                 <w:sz w:val="18"/>
@@ -4509,6 +5134,9 @@
             </w:tcMar>
           </w:tcPr>
           <w:p>
+            <w:pPr>
+              <w:keepNext w:val="0"/>
+            </w:pPr>
             <w:r>
               <w:rPr>
                 <w:sz w:val="18"/>
@@ -4533,6 +5161,9 @@
             </w:tcMar>
           </w:tcPr>
           <w:p>
+            <w:pPr>
+              <w:keepNext w:val="0"/>
+            </w:pPr>
             <w:r>
               <w:rPr>
                 <w:sz w:val="18"/>
@@ -4552,6 +5183,9 @@
             </w:tcMar>
           </w:tcPr>
           <w:p>
+            <w:pPr>
+              <w:keepNext w:val="0"/>
+            </w:pPr>
             <w:r>
               <w:rPr>
                 <w:sz w:val="18"/>
@@ -4571,6 +5205,9 @@
             </w:tcMar>
           </w:tcPr>
           <w:p>
+            <w:pPr>
+              <w:keepNext w:val="0"/>
+            </w:pPr>
             <w:r>
               <w:rPr>
                 <w:sz w:val="18"/>
@@ -4595,6 +5232,9 @@
             </w:tcMar>
           </w:tcPr>
           <w:p>
+            <w:pPr>
+              <w:keepNext w:val="0"/>
+            </w:pPr>
             <w:r>
               <w:rPr>
                 <w:sz w:val="18"/>
@@ -4614,6 +5254,9 @@
             </w:tcMar>
           </w:tcPr>
           <w:p>
+            <w:pPr>
+              <w:keepNext w:val="0"/>
+            </w:pPr>
             <w:r>
               <w:rPr>
                 <w:sz w:val="18"/>
@@ -4633,6 +5276,9 @@
             </w:tcMar>
           </w:tcPr>
           <w:p>
+            <w:pPr>
+              <w:keepNext w:val="0"/>
+            </w:pPr>
             <w:r>
               <w:rPr>
                 <w:sz w:val="18"/>
@@ -4658,6 +5304,10 @@
         <w:gridCol w:w="10166"/>
       </w:tblGrid>
       <w:tr>
+        <w:trPr>
+          <w:tblHeader/>
+          <w:cantSplit/>
+        </w:trPr>
         <w:tc>
           <w:tcPr>
             <w:tcW w:type="dxa" w:w="10166"/>
@@ -4670,6 +5320,9 @@
             </w:tcMar>
           </w:tcPr>
           <w:p>
+            <w:pPr>
+              <w:keepNext w:val="0"/>
+            </w:pPr>
             <w:r>
               <w:rPr>
                 <w:b/>
@@ -4798,6 +5451,7 @@
     </w:p>
     <w:p>
       <w:pPr>
+        <w:keepNext/>
         <w:jc w:val="center"/>
       </w:pPr>
       <w:r>
@@ -4838,10 +5492,15 @@
     <w:p>
       <w:pPr>
         <w:pStyle w:val="ETISCaption"/>
+        <w:keepNext w:val="0"/>
+        <w:keepLines/>
         <w:jc w:val="center"/>
       </w:pPr>
       <w:r>
         <w:t>Figure 5. Documentation architecture by audience. This Master Manual is the front door to the complete library.</w:t>
+      </w:r>
+      <w:r>
+        <w:t xml:space="preserve"> Historical reference figure; current text governs.</w:t>
       </w:r>
     </w:p>
     <w:tbl>
@@ -4860,6 +5519,8 @@
       <w:tr>
         <w:trPr>
           <w:tblHeader w:val="true"/>
+          <w:tblHeader/>
+          <w:cantSplit/>
         </w:trPr>
         <w:tc>
           <w:tcPr>
@@ -4873,6 +5534,9 @@
             </w:tcMar>
           </w:tcPr>
           <w:p>
+            <w:pPr>
+              <w:keepNext w:val="0"/>
+            </w:pPr>
             <w:r>
               <w:rPr>
                 <w:b/>
@@ -4895,6 +5559,9 @@
             </w:tcMar>
           </w:tcPr>
           <w:p>
+            <w:pPr>
+              <w:keepNext w:val="0"/>
+            </w:pPr>
             <w:r>
               <w:rPr>
                 <w:b/>
@@ -4917,6 +5584,9 @@
             </w:tcMar>
           </w:tcPr>
           <w:p>
+            <w:pPr>
+              <w:keepNext w:val="0"/>
+            </w:pPr>
             <w:r>
               <w:rPr>
                 <w:b/>
@@ -4939,6 +5609,9 @@
             </w:tcMar>
           </w:tcPr>
           <w:p>
+            <w:pPr>
+              <w:keepNext w:val="0"/>
+            </w:pPr>
             <w:r>
               <w:rPr>
                 <w:b/>
@@ -4965,6 +5638,9 @@
             </w:tcMar>
           </w:tcPr>
           <w:p>
+            <w:pPr>
+              <w:keepNext w:val="0"/>
+            </w:pPr>
             <w:r>
               <w:rPr>
                 <w:sz w:val="18"/>
@@ -4984,6 +5660,9 @@
             </w:tcMar>
           </w:tcPr>
           <w:p>
+            <w:pPr>
+              <w:keepNext w:val="0"/>
+            </w:pPr>
             <w:r>
               <w:rPr>
                 <w:sz w:val="18"/>
@@ -5003,6 +5682,9 @@
             </w:tcMar>
           </w:tcPr>
           <w:p>
+            <w:pPr>
+              <w:keepNext w:val="0"/>
+            </w:pPr>
             <w:r>
               <w:rPr>
                 <w:sz w:val="18"/>
@@ -5022,11 +5704,71 @@
             </w:tcMar>
           </w:tcPr>
           <w:p>
+            <w:pPr>
+              <w:keepNext w:val="0"/>
+            </w:pPr>
             <w:r>
               <w:rPr>
                 <w:sz w:val="18"/>
               </w:rPr>
               <w:t>System purpose, ETIS relationships, audience map, scenario index, governance, and the front door to the library.</w:t>
+            </w:r>
+          </w:p>
+        </w:tc>
+      </w:tr>
+      <w:tr>
+        <w:trPr>
+          <w:cantSplit/>
+        </w:trPr>
+        <w:tc>
+          <w:tcPr>
+            <w:tcW w:type="dxa" w:w="2541"/>
+          </w:tcPr>
+          <w:p>
+            <w:pPr>
+              <w:keepNext w:val="0"/>
+            </w:pPr>
+            <w:r>
+              <w:t>01</w:t>
+            </w:r>
+          </w:p>
+        </w:tc>
+        <w:tc>
+          <w:tcPr>
+            <w:tcW w:type="dxa" w:w="2541"/>
+          </w:tcPr>
+          <w:p>
+            <w:pPr>
+              <w:keepNext w:val="0"/>
+            </w:pPr>
+            <w:r>
+              <w:t>Executive Overview</w:t>
+            </w:r>
+          </w:p>
+        </w:tc>
+        <w:tc>
+          <w:tcPr>
+            <w:tcW w:type="dxa" w:w="2541"/>
+          </w:tcPr>
+          <w:p>
+            <w:pPr>
+              <w:keepNext w:val="0"/>
+            </w:pPr>
+            <w:r>
+              <w:t>Leadership / institutional adopter</w:t>
+            </w:r>
+          </w:p>
+        </w:tc>
+        <w:tc>
+          <w:tcPr>
+            <w:tcW w:type="dxa" w:w="2541"/>
+          </w:tcPr>
+          <w:p>
+            <w:pPr>
+              <w:keepNext w:val="0"/>
+            </w:pPr>
+            <w:r>
+              <w:t>Purpose, governance, educational value and adoption decisions.</w:t>
             </w:r>
           </w:p>
         </w:tc>
@@ -5046,6 +5788,9 @@
             </w:tcMar>
           </w:tcPr>
           <w:p>
+            <w:pPr>
+              <w:keepNext w:val="0"/>
+            </w:pPr>
             <w:r>
               <w:rPr>
                 <w:sz w:val="18"/>
@@ -5065,6 +5810,9 @@
             </w:tcMar>
           </w:tcPr>
           <w:p>
+            <w:pPr>
+              <w:keepNext w:val="0"/>
+            </w:pPr>
             <w:r>
               <w:rPr>
                 <w:sz w:val="18"/>
@@ -5084,6 +5832,9 @@
             </w:tcMar>
           </w:tcPr>
           <w:p>
+            <w:pPr>
+              <w:keepNext w:val="0"/>
+            </w:pPr>
             <w:r>
               <w:rPr>
                 <w:sz w:val="18"/>
@@ -5103,6 +5854,9 @@
             </w:tcMar>
           </w:tcPr>
           <w:p>
+            <w:pPr>
+              <w:keepNext w:val="0"/>
+            </w:pPr>
             <w:r>
               <w:rPr>
                 <w:sz w:val="18"/>
@@ -5127,6 +5881,9 @@
             </w:tcMar>
           </w:tcPr>
           <w:p>
+            <w:pPr>
+              <w:keepNext w:val="0"/>
+            </w:pPr>
             <w:r>
               <w:rPr>
                 <w:sz w:val="18"/>
@@ -5146,6 +5903,9 @@
             </w:tcMar>
           </w:tcPr>
           <w:p>
+            <w:pPr>
+              <w:keepNext w:val="0"/>
+            </w:pPr>
             <w:r>
               <w:rPr>
                 <w:sz w:val="18"/>
@@ -5165,6 +5925,9 @@
             </w:tcMar>
           </w:tcPr>
           <w:p>
+            <w:pPr>
+              <w:keepNext w:val="0"/>
+            </w:pPr>
             <w:r>
               <w:rPr>
                 <w:sz w:val="18"/>
@@ -5184,6 +5947,9 @@
             </w:tcMar>
           </w:tcPr>
           <w:p>
+            <w:pPr>
+              <w:keepNext w:val="0"/>
+            </w:pPr>
             <w:r>
               <w:rPr>
                 <w:sz w:val="18"/>
@@ -5208,6 +5974,9 @@
             </w:tcMar>
           </w:tcPr>
           <w:p>
+            <w:pPr>
+              <w:keepNext w:val="0"/>
+            </w:pPr>
             <w:r>
               <w:rPr>
                 <w:sz w:val="18"/>
@@ -5227,6 +5996,9 @@
             </w:tcMar>
           </w:tcPr>
           <w:p>
+            <w:pPr>
+              <w:keepNext w:val="0"/>
+            </w:pPr>
             <w:r>
               <w:rPr>
                 <w:sz w:val="18"/>
@@ -5246,6 +6018,9 @@
             </w:tcMar>
           </w:tcPr>
           <w:p>
+            <w:pPr>
+              <w:keepNext w:val="0"/>
+            </w:pPr>
             <w:r>
               <w:rPr>
                 <w:sz w:val="18"/>
@@ -5265,6 +6040,9 @@
             </w:tcMar>
           </w:tcPr>
           <w:p>
+            <w:pPr>
+              <w:keepNext w:val="0"/>
+            </w:pPr>
             <w:r>
               <w:rPr>
                 <w:sz w:val="18"/>
@@ -5289,6 +6067,9 @@
             </w:tcMar>
           </w:tcPr>
           <w:p>
+            <w:pPr>
+              <w:keepNext w:val="0"/>
+            </w:pPr>
             <w:r>
               <w:rPr>
                 <w:sz w:val="18"/>
@@ -5308,6 +6089,9 @@
             </w:tcMar>
           </w:tcPr>
           <w:p>
+            <w:pPr>
+              <w:keepNext w:val="0"/>
+            </w:pPr>
             <w:r>
               <w:rPr>
                 <w:sz w:val="18"/>
@@ -5327,6 +6111,9 @@
             </w:tcMar>
           </w:tcPr>
           <w:p>
+            <w:pPr>
+              <w:keepNext w:val="0"/>
+            </w:pPr>
             <w:r>
               <w:rPr>
                 <w:sz w:val="18"/>
@@ -5346,6 +6133,9 @@
             </w:tcMar>
           </w:tcPr>
           <w:p>
+            <w:pPr>
+              <w:keepNext w:val="0"/>
+            </w:pPr>
             <w:r>
               <w:rPr>
                 <w:sz w:val="18"/>
@@ -5370,6 +6160,9 @@
             </w:tcMar>
           </w:tcPr>
           <w:p>
+            <w:pPr>
+              <w:keepNext w:val="0"/>
+            </w:pPr>
             <w:r>
               <w:rPr>
                 <w:sz w:val="18"/>
@@ -5389,6 +6182,9 @@
             </w:tcMar>
           </w:tcPr>
           <w:p>
+            <w:pPr>
+              <w:keepNext w:val="0"/>
+            </w:pPr>
             <w:r>
               <w:rPr>
                 <w:sz w:val="18"/>
@@ -5408,6 +6204,9 @@
             </w:tcMar>
           </w:tcPr>
           <w:p>
+            <w:pPr>
+              <w:keepNext w:val="0"/>
+            </w:pPr>
             <w:r>
               <w:rPr>
                 <w:sz w:val="18"/>
@@ -5427,6 +6226,9 @@
             </w:tcMar>
           </w:tcPr>
           <w:p>
+            <w:pPr>
+              <w:keepNext w:val="0"/>
+            </w:pPr>
             <w:r>
               <w:rPr>
                 <w:sz w:val="18"/>
@@ -5451,6 +6253,9 @@
             </w:tcMar>
           </w:tcPr>
           <w:p>
+            <w:pPr>
+              <w:keepNext w:val="0"/>
+            </w:pPr>
             <w:r>
               <w:rPr>
                 <w:sz w:val="18"/>
@@ -5470,6 +6275,9 @@
             </w:tcMar>
           </w:tcPr>
           <w:p>
+            <w:pPr>
+              <w:keepNext w:val="0"/>
+            </w:pPr>
             <w:r>
               <w:rPr>
                 <w:sz w:val="18"/>
@@ -5489,6 +6297,9 @@
             </w:tcMar>
           </w:tcPr>
           <w:p>
+            <w:pPr>
+              <w:keepNext w:val="0"/>
+            </w:pPr>
             <w:r>
               <w:rPr>
                 <w:sz w:val="18"/>
@@ -5508,6 +6319,9 @@
             </w:tcMar>
           </w:tcPr>
           <w:p>
+            <w:pPr>
+              <w:keepNext w:val="0"/>
+            </w:pPr>
             <w:r>
               <w:rPr>
                 <w:sz w:val="18"/>
@@ -5532,6 +6346,9 @@
             </w:tcMar>
           </w:tcPr>
           <w:p>
+            <w:pPr>
+              <w:keepNext w:val="0"/>
+            </w:pPr>
             <w:r>
               <w:rPr>
                 <w:sz w:val="18"/>
@@ -5551,6 +6368,9 @@
             </w:tcMar>
           </w:tcPr>
           <w:p>
+            <w:pPr>
+              <w:keepNext w:val="0"/>
+            </w:pPr>
             <w:r>
               <w:rPr>
                 <w:sz w:val="18"/>
@@ -5570,6 +6390,9 @@
             </w:tcMar>
           </w:tcPr>
           <w:p>
+            <w:pPr>
+              <w:keepNext w:val="0"/>
+            </w:pPr>
             <w:r>
               <w:rPr>
                 <w:sz w:val="18"/>
@@ -5589,6 +6412,9 @@
             </w:tcMar>
           </w:tcPr>
           <w:p>
+            <w:pPr>
+              <w:keepNext w:val="0"/>
+            </w:pPr>
             <w:r>
               <w:rPr>
                 <w:sz w:val="18"/>
@@ -5613,6 +6439,9 @@
             </w:tcMar>
           </w:tcPr>
           <w:p>
+            <w:pPr>
+              <w:keepNext w:val="0"/>
+            </w:pPr>
             <w:r>
               <w:rPr>
                 <w:sz w:val="18"/>
@@ -5632,6 +6461,9 @@
             </w:tcMar>
           </w:tcPr>
           <w:p>
+            <w:pPr>
+              <w:keepNext w:val="0"/>
+            </w:pPr>
             <w:r>
               <w:rPr>
                 <w:sz w:val="18"/>
@@ -5651,6 +6483,9 @@
             </w:tcMar>
           </w:tcPr>
           <w:p>
+            <w:pPr>
+              <w:keepNext w:val="0"/>
+            </w:pPr>
             <w:r>
               <w:rPr>
                 <w:sz w:val="18"/>
@@ -5670,6 +6505,9 @@
             </w:tcMar>
           </w:tcPr>
           <w:p>
+            <w:pPr>
+              <w:keepNext w:val="0"/>
+            </w:pPr>
             <w:r>
               <w:rPr>
                 <w:sz w:val="18"/>
@@ -5694,6 +6532,9 @@
             </w:tcMar>
           </w:tcPr>
           <w:p>
+            <w:pPr>
+              <w:keepNext w:val="0"/>
+            </w:pPr>
             <w:r>
               <w:rPr>
                 <w:sz w:val="18"/>
@@ -5713,6 +6554,9 @@
             </w:tcMar>
           </w:tcPr>
           <w:p>
+            <w:pPr>
+              <w:keepNext w:val="0"/>
+            </w:pPr>
             <w:r>
               <w:rPr>
                 <w:sz w:val="18"/>
@@ -5732,6 +6576,9 @@
             </w:tcMar>
           </w:tcPr>
           <w:p>
+            <w:pPr>
+              <w:keepNext w:val="0"/>
+            </w:pPr>
             <w:r>
               <w:rPr>
                 <w:sz w:val="18"/>
@@ -5751,6 +6598,9 @@
             </w:tcMar>
           </w:tcPr>
           <w:p>
+            <w:pPr>
+              <w:keepNext w:val="0"/>
+            </w:pPr>
             <w:r>
               <w:rPr>
                 <w:sz w:val="18"/>
@@ -5775,6 +6625,9 @@
             </w:tcMar>
           </w:tcPr>
           <w:p>
+            <w:pPr>
+              <w:keepNext w:val="0"/>
+            </w:pPr>
             <w:r>
               <w:rPr>
                 <w:sz w:val="18"/>
@@ -5794,6 +6647,9 @@
             </w:tcMar>
           </w:tcPr>
           <w:p>
+            <w:pPr>
+              <w:keepNext w:val="0"/>
+            </w:pPr>
             <w:r>
               <w:rPr>
                 <w:sz w:val="18"/>
@@ -5813,6 +6669,9 @@
             </w:tcMar>
           </w:tcPr>
           <w:p>
+            <w:pPr>
+              <w:keepNext w:val="0"/>
+            </w:pPr>
             <w:r>
               <w:rPr>
                 <w:sz w:val="18"/>
@@ -5832,6 +6691,9 @@
             </w:tcMar>
           </w:tcPr>
           <w:p>
+            <w:pPr>
+              <w:keepNext w:val="0"/>
+            </w:pPr>
             <w:r>
               <w:rPr>
                 <w:sz w:val="18"/>
@@ -5857,6 +6719,10 @@
         <w:gridCol w:w="10166"/>
       </w:tblGrid>
       <w:tr>
+        <w:trPr>
+          <w:tblHeader/>
+          <w:cantSplit/>
+        </w:trPr>
         <w:tc>
           <w:tcPr>
             <w:tcW w:type="dxa" w:w="10166"/>
@@ -5869,6 +6735,9 @@
             </w:tcMar>
           </w:tcPr>
           <w:p>
+            <w:pPr>
+              <w:keepNext w:val="0"/>
+            </w:pPr>
             <w:r>
               <w:rPr>
                 <w:b/>
@@ -5882,7 +6751,7 @@
               <w:rPr>
                 <w:sz w:val="20"/>
               </w:rPr>
-              <w:t>This Master Manual intentionally serves the executive-overview role for the published library. The earlier standalone executive overview is superseded by this document unless a separate short executive brief is later published for institutional leadership.</w:t>
+              <w:t>Manual 01 is the active Executive Overview for leadership and adoption. This Master Manual remains the complete front door and documentation index; neither document supersedes the other.</w:t>
             </w:r>
           </w:p>
         </w:tc>
@@ -5916,6 +6785,8 @@
       <w:tr>
         <w:trPr>
           <w:tblHeader w:val="true"/>
+          <w:tblHeader/>
+          <w:cantSplit/>
         </w:trPr>
         <w:tc>
           <w:tcPr>
@@ -5929,6 +6800,9 @@
             </w:tcMar>
           </w:tcPr>
           <w:p>
+            <w:pPr>
+              <w:keepNext w:val="0"/>
+            </w:pPr>
             <w:r>
               <w:rPr>
                 <w:b/>
@@ -5951,6 +6825,9 @@
             </w:tcMar>
           </w:tcPr>
           <w:p>
+            <w:pPr>
+              <w:keepNext w:val="0"/>
+            </w:pPr>
             <w:r>
               <w:rPr>
                 <w:b/>
@@ -5973,6 +6850,9 @@
             </w:tcMar>
           </w:tcPr>
           <w:p>
+            <w:pPr>
+              <w:keepNext w:val="0"/>
+            </w:pPr>
             <w:r>
               <w:rPr>
                 <w:b/>
@@ -5999,6 +6879,9 @@
             </w:tcMar>
           </w:tcPr>
           <w:p>
+            <w:pPr>
+              <w:keepNext w:val="0"/>
+            </w:pPr>
             <w:r>
               <w:rPr>
                 <w:sz w:val="18"/>
@@ -6018,6 +6901,9 @@
             </w:tcMar>
           </w:tcPr>
           <w:p>
+            <w:pPr>
+              <w:keepNext w:val="0"/>
+            </w:pPr>
             <w:r>
               <w:rPr>
                 <w:sz w:val="18"/>
@@ -6037,6 +6923,9 @@
             </w:tcMar>
           </w:tcPr>
           <w:p>
+            <w:pPr>
+              <w:keepNext w:val="0"/>
+            </w:pPr>
             <w:r>
               <w:rPr>
                 <w:sz w:val="18"/>
@@ -6061,6 +6950,9 @@
             </w:tcMar>
           </w:tcPr>
           <w:p>
+            <w:pPr>
+              <w:keepNext w:val="0"/>
+            </w:pPr>
             <w:r>
               <w:rPr>
                 <w:sz w:val="18"/>
@@ -6080,6 +6972,9 @@
             </w:tcMar>
           </w:tcPr>
           <w:p>
+            <w:pPr>
+              <w:keepNext w:val="0"/>
+            </w:pPr>
             <w:r>
               <w:rPr>
                 <w:sz w:val="18"/>
@@ -6099,6 +6994,9 @@
             </w:tcMar>
           </w:tcPr>
           <w:p>
+            <w:pPr>
+              <w:keepNext w:val="0"/>
+            </w:pPr>
             <w:r>
               <w:rPr>
                 <w:sz w:val="18"/>
@@ -6123,6 +7021,9 @@
             </w:tcMar>
           </w:tcPr>
           <w:p>
+            <w:pPr>
+              <w:keepNext w:val="0"/>
+            </w:pPr>
             <w:r>
               <w:rPr>
                 <w:sz w:val="18"/>
@@ -6142,6 +7043,9 @@
             </w:tcMar>
           </w:tcPr>
           <w:p>
+            <w:pPr>
+              <w:keepNext w:val="0"/>
+            </w:pPr>
             <w:r>
               <w:rPr>
                 <w:sz w:val="18"/>
@@ -6161,6 +7065,9 @@
             </w:tcMar>
           </w:tcPr>
           <w:p>
+            <w:pPr>
+              <w:keepNext w:val="0"/>
+            </w:pPr>
             <w:r>
               <w:rPr>
                 <w:sz w:val="18"/>
@@ -6185,6 +7092,9 @@
             </w:tcMar>
           </w:tcPr>
           <w:p>
+            <w:pPr>
+              <w:keepNext w:val="0"/>
+            </w:pPr>
             <w:r>
               <w:rPr>
                 <w:sz w:val="18"/>
@@ -6204,6 +7114,9 @@
             </w:tcMar>
           </w:tcPr>
           <w:p>
+            <w:pPr>
+              <w:keepNext w:val="0"/>
+            </w:pPr>
             <w:r>
               <w:rPr>
                 <w:sz w:val="18"/>
@@ -6223,6 +7136,9 @@
             </w:tcMar>
           </w:tcPr>
           <w:p>
+            <w:pPr>
+              <w:keepNext w:val="0"/>
+            </w:pPr>
             <w:r>
               <w:rPr>
                 <w:sz w:val="18"/>
@@ -6247,6 +7163,9 @@
             </w:tcMar>
           </w:tcPr>
           <w:p>
+            <w:pPr>
+              <w:keepNext w:val="0"/>
+            </w:pPr>
             <w:r>
               <w:rPr>
                 <w:sz w:val="18"/>
@@ -6266,6 +7185,9 @@
             </w:tcMar>
           </w:tcPr>
           <w:p>
+            <w:pPr>
+              <w:keepNext w:val="0"/>
+            </w:pPr>
             <w:r>
               <w:rPr>
                 <w:sz w:val="18"/>
@@ -6285,6 +7207,9 @@
             </w:tcMar>
           </w:tcPr>
           <w:p>
+            <w:pPr>
+              <w:keepNext w:val="0"/>
+            </w:pPr>
             <w:r>
               <w:rPr>
                 <w:sz w:val="18"/>
@@ -6309,6 +7234,9 @@
             </w:tcMar>
           </w:tcPr>
           <w:p>
+            <w:pPr>
+              <w:keepNext w:val="0"/>
+            </w:pPr>
             <w:r>
               <w:rPr>
                 <w:sz w:val="18"/>
@@ -6328,6 +7256,9 @@
             </w:tcMar>
           </w:tcPr>
           <w:p>
+            <w:pPr>
+              <w:keepNext w:val="0"/>
+            </w:pPr>
             <w:r>
               <w:rPr>
                 <w:sz w:val="18"/>
@@ -6347,6 +7278,9 @@
             </w:tcMar>
           </w:tcPr>
           <w:p>
+            <w:pPr>
+              <w:keepNext w:val="0"/>
+            </w:pPr>
             <w:r>
               <w:rPr>
                 <w:sz w:val="18"/>
@@ -6371,6 +7305,9 @@
             </w:tcMar>
           </w:tcPr>
           <w:p>
+            <w:pPr>
+              <w:keepNext w:val="0"/>
+            </w:pPr>
             <w:r>
               <w:rPr>
                 <w:sz w:val="18"/>
@@ -6390,6 +7327,9 @@
             </w:tcMar>
           </w:tcPr>
           <w:p>
+            <w:pPr>
+              <w:keepNext w:val="0"/>
+            </w:pPr>
             <w:r>
               <w:rPr>
                 <w:sz w:val="18"/>
@@ -6409,6 +7349,9 @@
             </w:tcMar>
           </w:tcPr>
           <w:p>
+            <w:pPr>
+              <w:keepNext w:val="0"/>
+            </w:pPr>
             <w:r>
               <w:rPr>
                 <w:sz w:val="18"/>
@@ -6433,6 +7376,9 @@
             </w:tcMar>
           </w:tcPr>
           <w:p>
+            <w:pPr>
+              <w:keepNext w:val="0"/>
+            </w:pPr>
             <w:r>
               <w:rPr>
                 <w:sz w:val="18"/>
@@ -6452,6 +7398,9 @@
             </w:tcMar>
           </w:tcPr>
           <w:p>
+            <w:pPr>
+              <w:keepNext w:val="0"/>
+            </w:pPr>
             <w:r>
               <w:rPr>
                 <w:sz w:val="18"/>
@@ -6471,6 +7420,9 @@
             </w:tcMar>
           </w:tcPr>
           <w:p>
+            <w:pPr>
+              <w:keepNext w:val="0"/>
+            </w:pPr>
             <w:r>
               <w:rPr>
                 <w:sz w:val="18"/>
@@ -6495,6 +7447,9 @@
             </w:tcMar>
           </w:tcPr>
           <w:p>
+            <w:pPr>
+              <w:keepNext w:val="0"/>
+            </w:pPr>
             <w:r>
               <w:rPr>
                 <w:sz w:val="18"/>
@@ -6514,6 +7469,9 @@
             </w:tcMar>
           </w:tcPr>
           <w:p>
+            <w:pPr>
+              <w:keepNext w:val="0"/>
+            </w:pPr>
             <w:r>
               <w:rPr>
                 <w:sz w:val="18"/>
@@ -6533,6 +7491,9 @@
             </w:tcMar>
           </w:tcPr>
           <w:p>
+            <w:pPr>
+              <w:keepNext w:val="0"/>
+            </w:pPr>
             <w:r>
               <w:rPr>
                 <w:sz w:val="18"/>
@@ -6557,6 +7518,9 @@
             </w:tcMar>
           </w:tcPr>
           <w:p>
+            <w:pPr>
+              <w:keepNext w:val="0"/>
+            </w:pPr>
             <w:r>
               <w:rPr>
                 <w:sz w:val="18"/>
@@ -6576,6 +7540,9 @@
             </w:tcMar>
           </w:tcPr>
           <w:p>
+            <w:pPr>
+              <w:keepNext w:val="0"/>
+            </w:pPr>
             <w:r>
               <w:rPr>
                 <w:sz w:val="18"/>
@@ -6595,6 +7562,9 @@
             </w:tcMar>
           </w:tcPr>
           <w:p>
+            <w:pPr>
+              <w:keepNext w:val="0"/>
+            </w:pPr>
             <w:r>
               <w:rPr>
                 <w:sz w:val="18"/>
@@ -6619,6 +7589,9 @@
             </w:tcMar>
           </w:tcPr>
           <w:p>
+            <w:pPr>
+              <w:keepNext w:val="0"/>
+            </w:pPr>
             <w:r>
               <w:rPr>
                 <w:sz w:val="18"/>
@@ -6638,6 +7611,9 @@
             </w:tcMar>
           </w:tcPr>
           <w:p>
+            <w:pPr>
+              <w:keepNext w:val="0"/>
+            </w:pPr>
             <w:r>
               <w:rPr>
                 <w:sz w:val="18"/>
@@ -6657,6 +7633,9 @@
             </w:tcMar>
           </w:tcPr>
           <w:p>
+            <w:pPr>
+              <w:keepNext w:val="0"/>
+            </w:pPr>
             <w:r>
               <w:rPr>
                 <w:sz w:val="18"/>
@@ -6766,6 +7745,8 @@
       <w:tr>
         <w:trPr>
           <w:tblHeader w:val="true"/>
+          <w:tblHeader/>
+          <w:cantSplit/>
         </w:trPr>
         <w:tc>
           <w:tcPr>
@@ -6779,6 +7760,9 @@
             </w:tcMar>
           </w:tcPr>
           <w:p>
+            <w:pPr>
+              <w:keepNext w:val="0"/>
+            </w:pPr>
             <w:r>
               <w:rPr>
                 <w:b/>
@@ -6801,6 +7785,9 @@
             </w:tcMar>
           </w:tcPr>
           <w:p>
+            <w:pPr>
+              <w:keepNext w:val="0"/>
+            </w:pPr>
             <w:r>
               <w:rPr>
                 <w:b/>
@@ -6827,6 +7814,9 @@
             </w:tcMar>
           </w:tcPr>
           <w:p>
+            <w:pPr>
+              <w:keepNext w:val="0"/>
+            </w:pPr>
             <w:r>
               <w:rPr>
                 <w:sz w:val="18"/>
@@ -6846,6 +7836,9 @@
             </w:tcMar>
           </w:tcPr>
           <w:p>
+            <w:pPr>
+              <w:keepNext w:val="0"/>
+            </w:pPr>
             <w:r>
               <w:rPr>
                 <w:sz w:val="18"/>
@@ -6870,6 +7863,9 @@
             </w:tcMar>
           </w:tcPr>
           <w:p>
+            <w:pPr>
+              <w:keepNext w:val="0"/>
+            </w:pPr>
             <w:r>
               <w:rPr>
                 <w:sz w:val="18"/>
@@ -6889,6 +7885,9 @@
             </w:tcMar>
           </w:tcPr>
           <w:p>
+            <w:pPr>
+              <w:keepNext w:val="0"/>
+            </w:pPr>
             <w:r>
               <w:rPr>
                 <w:sz w:val="18"/>
@@ -6913,6 +7912,9 @@
             </w:tcMar>
           </w:tcPr>
           <w:p>
+            <w:pPr>
+              <w:keepNext w:val="0"/>
+            </w:pPr>
             <w:r>
               <w:rPr>
                 <w:sz w:val="18"/>
@@ -6932,6 +7934,9 @@
             </w:tcMar>
           </w:tcPr>
           <w:p>
+            <w:pPr>
+              <w:keepNext w:val="0"/>
+            </w:pPr>
             <w:r>
               <w:rPr>
                 <w:sz w:val="18"/>
@@ -6956,6 +7961,9 @@
             </w:tcMar>
           </w:tcPr>
           <w:p>
+            <w:pPr>
+              <w:keepNext w:val="0"/>
+            </w:pPr>
             <w:r>
               <w:rPr>
                 <w:sz w:val="18"/>
@@ -6975,6 +7983,9 @@
             </w:tcMar>
           </w:tcPr>
           <w:p>
+            <w:pPr>
+              <w:keepNext w:val="0"/>
+            </w:pPr>
             <w:r>
               <w:rPr>
                 <w:sz w:val="18"/>
@@ -6999,6 +8010,9 @@
             </w:tcMar>
           </w:tcPr>
           <w:p>
+            <w:pPr>
+              <w:keepNext w:val="0"/>
+            </w:pPr>
             <w:r>
               <w:rPr>
                 <w:sz w:val="18"/>
@@ -7018,6 +8032,9 @@
             </w:tcMar>
           </w:tcPr>
           <w:p>
+            <w:pPr>
+              <w:keepNext w:val="0"/>
+            </w:pPr>
             <w:r>
               <w:rPr>
                 <w:sz w:val="18"/>
@@ -7042,6 +8059,9 @@
             </w:tcMar>
           </w:tcPr>
           <w:p>
+            <w:pPr>
+              <w:keepNext w:val="0"/>
+            </w:pPr>
             <w:r>
               <w:rPr>
                 <w:sz w:val="18"/>
@@ -7061,6 +8081,9 @@
             </w:tcMar>
           </w:tcPr>
           <w:p>
+            <w:pPr>
+              <w:keepNext w:val="0"/>
+            </w:pPr>
             <w:r>
               <w:rPr>
                 <w:sz w:val="18"/>
@@ -7085,6 +8108,9 @@
             </w:tcMar>
           </w:tcPr>
           <w:p>
+            <w:pPr>
+              <w:keepNext w:val="0"/>
+            </w:pPr>
             <w:r>
               <w:rPr>
                 <w:sz w:val="18"/>
@@ -7104,6 +8130,9 @@
             </w:tcMar>
           </w:tcPr>
           <w:p>
+            <w:pPr>
+              <w:keepNext w:val="0"/>
+            </w:pPr>
             <w:r>
               <w:rPr>
                 <w:sz w:val="18"/>
@@ -7166,6 +8195,29 @@
     </w:p>
     <w:p>
       <w:pPr>
+        <w:pStyle w:val="Heading2"/>
+      </w:pPr>
+      <w:r>
+        <w:t>Release and documentation authority</w:t>
+      </w:r>
+    </w:p>
+    <w:p>
+      <w:r>
+        <w:t>The v0.18.0 source version is defined in apps/api/app/version.py. FastAPI/OpenAPI and /health use that value. Source version, merged Git SHA, immutable image/revision, deployment success and production acceptance are separate evidence. The August GO records and v0.17 analytical history keep their original dates and versions.</w:t>
+      </w:r>
+    </w:p>
+    <w:p>
+      <w:r>
+        <w:t>Production defaults remain legacy reasoning and legacy planning. Shadow validator/planner/selector/realizer evaluation remains internal and does not replace student-visible authority. This release introduces no PR5 authority transfer, database migration or course-model change.</w:t>
+      </w:r>
+    </w:p>
+    <w:p>
+      <w:r>
+        <w:t>All 12 manuals (00–11) have matching DOCX and regenerated PDF editions. Manual 01 is the active leadership brief; this Master Manual is the full library front door. See docs/manuals/README.md and docs/releases/v0.18.0.md for the paired inventory and release sequence.</w:t>
+      </w:r>
+    </w:p>
+    <w:p>
+      <w:pPr>
         <w:pStyle w:val="Heading1"/>
       </w:pPr>
       <w:r>
@@ -7186,6 +8238,8 @@
       <w:tr>
         <w:trPr>
           <w:tblHeader w:val="true"/>
+          <w:tblHeader/>
+          <w:cantSplit/>
         </w:trPr>
         <w:tc>
           <w:tcPr>
@@ -7199,6 +8253,9 @@
             </w:tcMar>
           </w:tcPr>
           <w:p>
+            <w:pPr>
+              <w:keepNext w:val="0"/>
+            </w:pPr>
             <w:r>
               <w:rPr>
                 <w:b/>
@@ -7221,6 +8278,9 @@
             </w:tcMar>
           </w:tcPr>
           <w:p>
+            <w:pPr>
+              <w:keepNext w:val="0"/>
+            </w:pPr>
             <w:r>
               <w:rPr>
                 <w:b/>
@@ -7247,6 +8307,9 @@
             </w:tcMar>
           </w:tcPr>
           <w:p>
+            <w:pPr>
+              <w:keepNext w:val="0"/>
+            </w:pPr>
             <w:r>
               <w:rPr>
                 <w:sz w:val="18"/>
@@ -7266,6 +8329,9 @@
             </w:tcMar>
           </w:tcPr>
           <w:p>
+            <w:pPr>
+              <w:keepNext w:val="0"/>
+            </w:pPr>
             <w:r>
               <w:rPr>
                 <w:sz w:val="18"/>
@@ -7290,6 +8356,9 @@
             </w:tcMar>
           </w:tcPr>
           <w:p>
+            <w:pPr>
+              <w:keepNext w:val="0"/>
+            </w:pPr>
             <w:r>
               <w:rPr>
                 <w:sz w:val="18"/>
@@ -7309,6 +8378,9 @@
             </w:tcMar>
           </w:tcPr>
           <w:p>
+            <w:pPr>
+              <w:keepNext w:val="0"/>
+            </w:pPr>
             <w:r>
               <w:rPr>
                 <w:sz w:val="18"/>
@@ -7333,6 +8405,9 @@
             </w:tcMar>
           </w:tcPr>
           <w:p>
+            <w:pPr>
+              <w:keepNext w:val="0"/>
+            </w:pPr>
             <w:r>
               <w:rPr>
                 <w:sz w:val="18"/>
@@ -7352,6 +8427,9 @@
             </w:tcMar>
           </w:tcPr>
           <w:p>
+            <w:pPr>
+              <w:keepNext w:val="0"/>
+            </w:pPr>
             <w:r>
               <w:rPr>
                 <w:sz w:val="18"/>
@@ -7376,6 +8454,9 @@
             </w:tcMar>
           </w:tcPr>
           <w:p>
+            <w:pPr>
+              <w:keepNext w:val="0"/>
+            </w:pPr>
             <w:r>
               <w:rPr>
                 <w:sz w:val="18"/>
@@ -7395,6 +8476,9 @@
             </w:tcMar>
           </w:tcPr>
           <w:p>
+            <w:pPr>
+              <w:keepNext w:val="0"/>
+            </w:pPr>
             <w:r>
               <w:rPr>
                 <w:sz w:val="18"/>
@@ -7419,6 +8503,9 @@
             </w:tcMar>
           </w:tcPr>
           <w:p>
+            <w:pPr>
+              <w:keepNext w:val="0"/>
+            </w:pPr>
             <w:r>
               <w:rPr>
                 <w:sz w:val="18"/>
@@ -7438,6 +8525,9 @@
             </w:tcMar>
           </w:tcPr>
           <w:p>
+            <w:pPr>
+              <w:keepNext w:val="0"/>
+            </w:pPr>
             <w:r>
               <w:rPr>
                 <w:sz w:val="18"/>
@@ -7462,6 +8552,9 @@
             </w:tcMar>
           </w:tcPr>
           <w:p>
+            <w:pPr>
+              <w:keepNext w:val="0"/>
+            </w:pPr>
             <w:r>
               <w:rPr>
                 <w:sz w:val="18"/>
@@ -7481,6 +8574,9 @@
             </w:tcMar>
           </w:tcPr>
           <w:p>
+            <w:pPr>
+              <w:keepNext w:val="0"/>
+            </w:pPr>
             <w:r>
               <w:rPr>
                 <w:sz w:val="18"/>
@@ -7505,6 +8601,9 @@
             </w:tcMar>
           </w:tcPr>
           <w:p>
+            <w:pPr>
+              <w:keepNext w:val="0"/>
+            </w:pPr>
             <w:r>
               <w:rPr>
                 <w:sz w:val="18"/>
@@ -7524,6 +8623,9 @@
             </w:tcMar>
           </w:tcPr>
           <w:p>
+            <w:pPr>
+              <w:keepNext w:val="0"/>
+            </w:pPr>
             <w:r>
               <w:rPr>
                 <w:sz w:val="18"/>
@@ -7548,6 +8650,9 @@
             </w:tcMar>
           </w:tcPr>
           <w:p>
+            <w:pPr>
+              <w:keepNext w:val="0"/>
+            </w:pPr>
             <w:r>
               <w:rPr>
                 <w:sz w:val="18"/>
@@ -7567,6 +8672,9 @@
             </w:tcMar>
           </w:tcPr>
           <w:p>
+            <w:pPr>
+              <w:keepNext w:val="0"/>
+            </w:pPr>
             <w:r>
               <w:rPr>
                 <w:sz w:val="18"/>
@@ -7591,6 +8699,9 @@
             </w:tcMar>
           </w:tcPr>
           <w:p>
+            <w:pPr>
+              <w:keepNext w:val="0"/>
+            </w:pPr>
             <w:r>
               <w:rPr>
                 <w:sz w:val="18"/>
@@ -7610,6 +8721,9 @@
             </w:tcMar>
           </w:tcPr>
           <w:p>
+            <w:pPr>
+              <w:keepNext w:val="0"/>
+            </w:pPr>
             <w:r>
               <w:rPr>
                 <w:sz w:val="18"/>
@@ -7634,6 +8748,9 @@
             </w:tcMar>
           </w:tcPr>
           <w:p>
+            <w:pPr>
+              <w:keepNext w:val="0"/>
+            </w:pPr>
             <w:r>
               <w:rPr>
                 <w:sz w:val="18"/>
@@ -7653,6 +8770,9 @@
             </w:tcMar>
           </w:tcPr>
           <w:p>
+            <w:pPr>
+              <w:keepNext w:val="0"/>
+            </w:pPr>
             <w:r>
               <w:rPr>
                 <w:sz w:val="18"/>
@@ -7677,6 +8797,9 @@
             </w:tcMar>
           </w:tcPr>
           <w:p>
+            <w:pPr>
+              <w:keepNext w:val="0"/>
+            </w:pPr>
             <w:r>
               <w:rPr>
                 <w:sz w:val="18"/>
@@ -7696,6 +8819,9 @@
             </w:tcMar>
           </w:tcPr>
           <w:p>
+            <w:pPr>
+              <w:keepNext w:val="0"/>
+            </w:pPr>
             <w:r>
               <w:rPr>
                 <w:sz w:val="18"/>
@@ -7734,6 +8860,8 @@
       <w:tr>
         <w:trPr>
           <w:tblHeader w:val="true"/>
+          <w:tblHeader/>
+          <w:cantSplit/>
         </w:trPr>
         <w:tc>
           <w:tcPr>
@@ -7747,6 +8875,9 @@
             </w:tcMar>
           </w:tcPr>
           <w:p>
+            <w:pPr>
+              <w:keepNext w:val="0"/>
+            </w:pPr>
             <w:r>
               <w:rPr>
                 <w:b/>
@@ -7769,6 +8900,9 @@
             </w:tcMar>
           </w:tcPr>
           <w:p>
+            <w:pPr>
+              <w:keepNext w:val="0"/>
+            </w:pPr>
             <w:r>
               <w:rPr>
                 <w:b/>
@@ -7791,6 +8925,9 @@
             </w:tcMar>
           </w:tcPr>
           <w:p>
+            <w:pPr>
+              <w:keepNext w:val="0"/>
+            </w:pPr>
             <w:r>
               <w:rPr>
                 <w:b/>
@@ -7817,6 +8954,9 @@
             </w:tcMar>
           </w:tcPr>
           <w:p>
+            <w:pPr>
+              <w:keepNext w:val="0"/>
+            </w:pPr>
             <w:r>
               <w:rPr>
                 <w:sz w:val="18"/>
@@ -7836,6 +8976,9 @@
             </w:tcMar>
           </w:tcPr>
           <w:p>
+            <w:pPr>
+              <w:keepNext w:val="0"/>
+            </w:pPr>
             <w:r>
               <w:rPr>
                 <w:sz w:val="18"/>
@@ -7855,6 +8998,9 @@
             </w:tcMar>
           </w:tcPr>
           <w:p>
+            <w:pPr>
+              <w:keepNext w:val="0"/>
+            </w:pPr>
             <w:r>
               <w:rPr>
                 <w:sz w:val="18"/>
@@ -7879,6 +9025,9 @@
             </w:tcMar>
           </w:tcPr>
           <w:p>
+            <w:pPr>
+              <w:keepNext w:val="0"/>
+            </w:pPr>
             <w:r>
               <w:rPr>
                 <w:sz w:val="18"/>
@@ -7898,6 +9047,9 @@
             </w:tcMar>
           </w:tcPr>
           <w:p>
+            <w:pPr>
+              <w:keepNext w:val="0"/>
+            </w:pPr>
             <w:r>
               <w:rPr>
                 <w:sz w:val="18"/>
@@ -7917,6 +9069,9 @@
             </w:tcMar>
           </w:tcPr>
           <w:p>
+            <w:pPr>
+              <w:keepNext w:val="0"/>
+            </w:pPr>
             <w:r>
               <w:rPr>
                 <w:sz w:val="18"/>
@@ -7941,6 +9096,9 @@
             </w:tcMar>
           </w:tcPr>
           <w:p>
+            <w:pPr>
+              <w:keepNext w:val="0"/>
+            </w:pPr>
             <w:r>
               <w:rPr>
                 <w:sz w:val="18"/>
@@ -7960,6 +9118,9 @@
             </w:tcMar>
           </w:tcPr>
           <w:p>
+            <w:pPr>
+              <w:keepNext w:val="0"/>
+            </w:pPr>
             <w:r>
               <w:rPr>
                 <w:sz w:val="18"/>
@@ -7979,6 +9140,9 @@
             </w:tcMar>
           </w:tcPr>
           <w:p>
+            <w:pPr>
+              <w:keepNext w:val="0"/>
+            </w:pPr>
             <w:r>
               <w:rPr>
                 <w:sz w:val="18"/>
@@ -8003,6 +9167,9 @@
             </w:tcMar>
           </w:tcPr>
           <w:p>
+            <w:pPr>
+              <w:keepNext w:val="0"/>
+            </w:pPr>
             <w:r>
               <w:rPr>
                 <w:sz w:val="18"/>
@@ -8022,6 +9189,9 @@
             </w:tcMar>
           </w:tcPr>
           <w:p>
+            <w:pPr>
+              <w:keepNext w:val="0"/>
+            </w:pPr>
             <w:r>
               <w:rPr>
                 <w:sz w:val="18"/>
@@ -8041,6 +9211,9 @@
             </w:tcMar>
           </w:tcPr>
           <w:p>
+            <w:pPr>
+              <w:keepNext w:val="0"/>
+            </w:pPr>
             <w:r>
               <w:rPr>
                 <w:sz w:val="18"/>
@@ -8065,6 +9238,9 @@
             </w:tcMar>
           </w:tcPr>
           <w:p>
+            <w:pPr>
+              <w:keepNext w:val="0"/>
+            </w:pPr>
             <w:r>
               <w:rPr>
                 <w:sz w:val="18"/>
@@ -8084,6 +9260,9 @@
             </w:tcMar>
           </w:tcPr>
           <w:p>
+            <w:pPr>
+              <w:keepNext w:val="0"/>
+            </w:pPr>
             <w:r>
               <w:rPr>
                 <w:sz w:val="18"/>
@@ -8103,6 +9282,9 @@
             </w:tcMar>
           </w:tcPr>
           <w:p>
+            <w:pPr>
+              <w:keepNext w:val="0"/>
+            </w:pPr>
             <w:r>
               <w:rPr>
                 <w:sz w:val="18"/>
@@ -8127,6 +9309,9 @@
             </w:tcMar>
           </w:tcPr>
           <w:p>
+            <w:pPr>
+              <w:keepNext w:val="0"/>
+            </w:pPr>
             <w:r>
               <w:rPr>
                 <w:sz w:val="18"/>
@@ -8146,6 +9331,9 @@
             </w:tcMar>
           </w:tcPr>
           <w:p>
+            <w:pPr>
+              <w:keepNext w:val="0"/>
+            </w:pPr>
             <w:r>
               <w:rPr>
                 <w:sz w:val="18"/>
@@ -8165,6 +9353,9 @@
             </w:tcMar>
           </w:tcPr>
           <w:p>
+            <w:pPr>
+              <w:keepNext w:val="0"/>
+            </w:pPr>
             <w:r>
               <w:rPr>
                 <w:sz w:val="18"/>
@@ -8189,6 +9380,9 @@
             </w:tcMar>
           </w:tcPr>
           <w:p>
+            <w:pPr>
+              <w:keepNext w:val="0"/>
+            </w:pPr>
             <w:r>
               <w:rPr>
                 <w:sz w:val="18"/>
@@ -8208,6 +9402,9 @@
             </w:tcMar>
           </w:tcPr>
           <w:p>
+            <w:pPr>
+              <w:keepNext w:val="0"/>
+            </w:pPr>
             <w:r>
               <w:rPr>
                 <w:sz w:val="18"/>
@@ -8227,6 +9424,9 @@
             </w:tcMar>
           </w:tcPr>
           <w:p>
+            <w:pPr>
+              <w:keepNext w:val="0"/>
+            </w:pPr>
             <w:r>
               <w:rPr>
                 <w:sz w:val="18"/>
@@ -8251,6 +9451,9 @@
             </w:tcMar>
           </w:tcPr>
           <w:p>
+            <w:pPr>
+              <w:keepNext w:val="0"/>
+            </w:pPr>
             <w:r>
               <w:rPr>
                 <w:sz w:val="18"/>
@@ -8270,6 +9473,9 @@
             </w:tcMar>
           </w:tcPr>
           <w:p>
+            <w:pPr>
+              <w:keepNext w:val="0"/>
+            </w:pPr>
             <w:r>
               <w:rPr>
                 <w:sz w:val="18"/>
@@ -8289,6 +9495,9 @@
             </w:tcMar>
           </w:tcPr>
           <w:p>
+            <w:pPr>
+              <w:keepNext w:val="0"/>
+            </w:pPr>
             <w:r>
               <w:rPr>
                 <w:sz w:val="18"/>
@@ -8472,6 +9681,10 @@
         <w:gridCol w:w="10166"/>
       </w:tblGrid>
       <w:tr>
+        <w:trPr>
+          <w:tblHeader/>
+          <w:cantSplit/>
+        </w:trPr>
         <w:tc>
           <w:tcPr>
             <w:tcW w:type="dxa" w:w="10166"/>
@@ -8484,6 +9697,9 @@
             </w:tcMar>
           </w:tcPr>
           <w:p>
+            <w:pPr>
+              <w:keepNext w:val="0"/>
+            </w:pPr>
             <w:r>
               <w:rPr>
                 <w:b/>
@@ -8512,7 +9728,7 @@
       <w:headerReference w:type="default" r:id="rId9"/>
       <w:footerReference w:type="default" r:id="rId10"/>
       <w:pgSz w:w="12240" w:h="15840"/>
-      <w:pgMar w:top="936" w:right="1037" w:bottom="936" w:left="1037" w:header="720" w:footer="720" w:gutter="0"/>
+      <w:pgMar w:top="1512" w:right="1037" w:bottom="1080" w:left="1037" w:header="720" w:footer="504" w:gutter="0"/>
       <w:cols w:space="720"/>
       <w:docGrid w:linePitch="360"/>
     </w:sectPr>
@@ -9327,16 +10543,13 @@
     <w:qFormat/>
     <w:rsid w:val="00FC693F"/>
     <w:pPr>
-      <w:pBdr>
-        <w:bottom w:val="single" w:sz="8" w:space="4" w:color="4F81BD" w:themeColor="accent1"/>
-      </w:pBdr>
       <w:spacing w:after="80" w:line="240" w:lineRule="auto" w:before="160"/>
       <w:contextualSpacing/>
     </w:pPr>
     <w:rPr>
       <w:rFonts w:asciiTheme="majorHAnsi" w:eastAsiaTheme="majorEastAsia" w:hAnsiTheme="majorHAnsi" w:cstheme="majorBidi" w:ascii="Arial" w:hAnsi="Arial"/>
       <w:b/>
-      <w:color w:val="0B1722"/>
+      <w:color w:val="000000"/>
       <w:spacing w:val="5"/>
       <w:kern w:val="28"/>
       <w:sz w:val="56"/>

</xml_diff>

<commit_message>
feat(studio): clarify two-room and multi-review student journey (v0.18.1)
</commit_message>
<xml_diff>
--- a/docs/manuals/00_ETIS_Engineering_Studio_Master_Manual_and_Documentation_Index.docx
+++ b/docs/manuals/00_ETIS_Engineering_Studio_Master_Manual_and_Documentation_Index.docx
@@ -37,7 +37,7 @@
     </w:p>
     <w:p>
       <w:r>
-        <w:t>v0.18.0 release manual edition. Production acceptance has separate source and deployment provenance.</w:t>
+        <w:t>v0.18.1 candidate manual edition. Local UI validation only; production remains accepted v0.18.0 until protected deployment and human acceptance.</w:t>
       </w:r>
     </w:p>
     <w:tbl>
@@ -9723,6 +9723,71 @@
       <w:pPr>
         <w:spacing w:after="20"/>
       </w:pPr>
+    </w:p>
+    <w:p>
+      <w:r>
+        <w:br w:type="page"/>
+      </w:r>
+    </w:p>
+    <w:p>
+      <w:pPr>
+        <w:pStyle w:val="Heading1"/>
+      </w:pPr>
+      <w:r>
+        <w:t>Student workflow and review lifecycle — v0.18.1 candidate</w:t>
+      </w:r>
+    </w:p>
+    <w:p>
+      <w:pPr>
+        <w:pStyle w:val="Heading2"/>
+      </w:pPr>
+      <w:r>
+        <w:t>Scope and authority</w:t>
+      </w:r>
+    </w:p>
+    <w:p>
+      <w:r>
+        <w:t>The revised student interface explicitly pairs Engineering Review Room (discussion) and Engineering Evidence Room (inspection). “Review Board” names the AI reviewers; these are not instructor approval or grading authorities.</w:t>
+      </w:r>
+    </w:p>
+    <w:p>
+      <w:pPr>
+        <w:pStyle w:val="Heading2"/>
+      </w:pPr>
+      <w:r>
+        <w:t>Review sessions and evidence</w:t>
+      </w:r>
+    </w:p>
+    <w:p>
+      <w:r>
+        <w:t>A student can have multiple open Board Review conversations. Only one is currently displayed. Finished reviews remain preserved and read-only. Every session references immutable frozen repository evidence; a distinct conversation can reuse the same snapshot if the repository revision and phase have not changed.</w:t>
+      </w:r>
+    </w:p>
+    <w:p>
+      <w:pPr>
+        <w:pStyle w:val="Heading2"/>
+      </w:pPr>
+      <w:r>
+        <w:t>Documentation routing</w:t>
+      </w:r>
+    </w:p>
+    <w:p>
+      <w:r>
+        <w:t>Use Manual 05 for the complete student walkthrough, Manual 07 for the one-page review-cycle orientation, Manual 04 for teaching-staff support, Manual 03 for engineering boundaries, Manual 02 for administration, and Manual 09 for production release and acceptance.</w:t>
+      </w:r>
+    </w:p>
+    <w:p>
+      <w:pPr>
+        <w:pStyle w:val="Heading2"/>
+      </w:pPr>
+      <w:r>
+        <w:t>Release evidence</w:t>
+      </w:r>
+    </w:p>
+    <w:p>
+      <w:r>
+        <w:t>This is a source candidate: functional simulation is not proof of Azure production operation, actual GitHub synchronization, live reviewer quality, screen-reader acceptance, or independent student comprehension. The October 2 v0.18.0 production record is historical and unchanged.</w:t>
+      </w:r>
     </w:p>
     <w:sectPr>
       <w:headerReference w:type="default" r:id="rId9"/>

</xml_diff>

<commit_message>
docs(studio): publish v0.18.1 student manuals and master index
</commit_message>
<xml_diff>
--- a/docs/manuals/00_ETIS_Engineering_Studio_Master_Manual_and_Documentation_Index.docx
+++ b/docs/manuals/00_ETIS_Engineering_Studio_Master_Manual_and_Documentation_Index.docx
@@ -37,7 +37,7 @@
     </w:p>
     <w:p>
       <w:r>
-        <w:t>v0.18.1 candidate manual edition. Local UI validation only; production remains accepted v0.18.0 until protected deployment and human acceptance.</w:t>
+        <w:t>v0.18.1 deployed in production. Operational health, shadow/shadow modes and authenticated student UI smoke have been verified; independent uncoached-student and screen-reader acceptance remain separately tracked.</w:t>
       </w:r>
     </w:p>
     <w:tbl>
@@ -234,7 +234,7 @@
               <w:keepNext w:val="0"/>
             </w:pPr>
             <w:r>
-              <w:t>v0.18.0 • October 2, 2026</w:t>
+              <w:t>v0.18.1 • October 9, 2026</w:t>
             </w:r>
           </w:p>
         </w:tc>
@@ -1985,7 +1985,7 @@
               <w:rPr>
                 <w:sz w:val="18"/>
               </w:rPr>
-              <w:t>05 Student User Guide</w:t>
+              <w:t>05a Start Here; 05 Student User Guide</w:t>
             </w:r>
           </w:p>
         </w:tc>
@@ -2269,7 +2269,7 @@
               <w:rPr>
                 <w:sz w:val="18"/>
               </w:rPr>
-              <w:t>05, 07</w:t>
+              <w:t>05a, 05, 07</w:t>
             </w:r>
           </w:p>
         </w:tc>
@@ -2485,7 +2485,7 @@
     </w:p>
     <w:p>
       <w:r>
-        <w:t>The Review Room is the conversation home. Engineering Evidence is the saved source notebook. Same-snapshot and newer-saved-snapshot notices explain their relationship; browsing newer saved evidence never changes an active review’s frozen baseline.</w:t>
+        <w:t>Engineering Review Room is the home for conversation and engineering coaching. Engineering Evidence Room is the saved source notebook. The latest saved evidence can be visible even when no review is selected, and may differ from the selected review’s frozen snapshot. Room switching never changes a review’s historical evidence.</w:t>
       </w:r>
     </w:p>
     <w:p>
@@ -5458,7 +5458,7 @@
         <w:drawing>
           <wp:inline xmlns:a="http://schemas.openxmlformats.org/drawingml/2006/main" xmlns:pic="http://schemas.openxmlformats.org/drawingml/2006/picture">
             <wp:extent cx="6080760" cy="3328416"/>
-            <wp:docPr id="5" name="Picture 5" descr="Figure 5. Documentation architecture by audience. This Master Manual is the front door to the complete library." title="Figure 5"/>
+            <wp:docPr id="5" name="Picture 5" descr="Documentation audience map. Student resources: 05a Start Here, 05 Student User Guide, 06 Team Setup Quickstart, and 07 Student Cheat Sheet. Other rows list Teaching Staff, Technical Admin, and Production Operator manuals." title="Figure 5"/>
             <wp:cNvGraphicFramePr>
               <a:graphicFrameLocks noChangeAspect="1"/>
             </wp:cNvGraphicFramePr>
@@ -5497,11 +5497,9 @@
         <w:jc w:val="center"/>
       </w:pPr>
       <w:r>
-        <w:t>Figure 5. Documentation architecture by audience. This Master Manual is the front door to the complete library.</w:t>
+        <w:t>Figure 5. Documentation architecture by audience. The student tier includes 05a Start Here, 05 Student User Guide, 06 Team Setup Quickstart and 07 Cheat Sheet.</w:t>
       </w:r>
-      <w:r>
-        <w:t xml:space="preserve"> Historical reference figure; current text governs.</w:t>
-      </w:r>
+      <w:r/>
     </w:p>
     <w:tbl>
       <w:tblPr>
@@ -6140,7 +6138,7 @@
               <w:rPr>
                 <w:sz w:val="18"/>
               </w:rPr>
-              <w:t>Complete student experience: sign-in, team/repository trust, evidence, snapshots, reviews, recommendations, findings, history, help, troubleshooting.</w:t>
+              <w:t>Complete illustrated, task-based student reference: setup, two-room workflow, three review types, coaching and reviewer roles, snapshots, findings, decisions, history, and troubleshooting.</w:t>
             </w:r>
           </w:p>
         </w:tc>
@@ -6167,7 +6165,7 @@
               <w:rPr>
                 <w:sz w:val="18"/>
               </w:rPr>
-              <w:t>06</w:t>
+              <w:t>05a</w:t>
             </w:r>
           </w:p>
         </w:tc>
@@ -6189,7 +6187,7 @@
               <w:rPr>
                 <w:sz w:val="18"/>
               </w:rPr>
-              <w:t>Team GitHub &amp; Repository Setup Quickstart</w:t>
+              <w:t>Start Here — One-Page Student Orientation</w:t>
             </w:r>
           </w:p>
         </w:tc>
@@ -6211,7 +6209,7 @@
               <w:rPr>
                 <w:sz w:val="18"/>
               </w:rPr>
-              <w:t>Student team</w:t>
+              <w:t>First-time student</w:t>
             </w:r>
           </w:p>
         </w:tc>
@@ -6233,7 +6231,7 @@
               <w:rPr>
                 <w:sz w:val="18"/>
               </w:rPr>
-              <w:t>Fast, controlled team repository onboarding and GitHub authorization/verification troubleshooting.</w:t>
+              <w:t>One-page entry point: two rooms, first five moves, Board versus Focused Review, review status, snapshots, and Help. Read this before the Cheat Sheet or User Guide.</w:t>
             </w:r>
           </w:p>
         </w:tc>
@@ -6260,7 +6258,7 @@
               <w:rPr>
                 <w:sz w:val="18"/>
               </w:rPr>
-              <w:t>07</w:t>
+              <w:t>06</w:t>
             </w:r>
           </w:p>
         </w:tc>
@@ -6282,7 +6280,7 @@
               <w:rPr>
                 <w:sz w:val="18"/>
               </w:rPr>
-              <w:t>Student Cheat Sheet / Quick Reference</w:t>
+              <w:t>Team GitHub &amp; Repository Setup Quickstart</w:t>
             </w:r>
           </w:p>
         </w:tc>
@@ -6304,7 +6302,7 @@
               <w:rPr>
                 <w:sz w:val="18"/>
               </w:rPr>
-              <w:t>Student</w:t>
+              <w:t>Student team</w:t>
             </w:r>
           </w:p>
         </w:tc>
@@ -6326,7 +6324,100 @@
               <w:rPr>
                 <w:sz w:val="18"/>
               </w:rPr>
-              <w:t>Compact review-choice, recommendation, findings, history, and troubleshooting reference for normal use.</w:t>
+              <w:t>Fast, controlled team repository onboarding and GitHub authorization/verification troubleshooting.</w:t>
+            </w:r>
+          </w:p>
+        </w:tc>
+      </w:tr>
+      <w:tr>
+        <w:trPr>
+          <w:cantSplit/>
+        </w:trPr>
+        <w:tc>
+          <w:tcPr>
+            <w:tcW w:type="dxa" w:w="648"/>
+            <w:tcMar>
+              <w:top w:w="90" w:type="dxa"/>
+              <w:start w:w="100" w:type="dxa"/>
+              <w:bottom w:w="90" w:type="dxa"/>
+              <w:end w:w="100" w:type="dxa"/>
+            </w:tcMar>
+          </w:tcPr>
+          <w:p>
+            <w:pPr>
+              <w:keepNext w:val="0"/>
+            </w:pPr>
+            <w:r>
+              <w:rPr>
+                <w:sz w:val="18"/>
+              </w:rPr>
+              <w:t>07</w:t>
+            </w:r>
+          </w:p>
+        </w:tc>
+        <w:tc>
+          <w:tcPr>
+            <w:tcW w:type="dxa" w:w="2520"/>
+            <w:tcMar>
+              <w:top w:w="90" w:type="dxa"/>
+              <w:start w:w="100" w:type="dxa"/>
+              <w:bottom w:w="90" w:type="dxa"/>
+              <w:end w:w="100" w:type="dxa"/>
+            </w:tcMar>
+          </w:tcPr>
+          <w:p>
+            <w:pPr>
+              <w:keepNext w:val="0"/>
+            </w:pPr>
+            <w:r>
+              <w:rPr>
+                <w:sz w:val="18"/>
+              </w:rPr>
+              <w:t>Student Cheat Sheet / Quick Reference</w:t>
+            </w:r>
+          </w:p>
+        </w:tc>
+        <w:tc>
+          <w:tcPr>
+            <w:tcW w:type="dxa" w:w="2232"/>
+            <w:tcMar>
+              <w:top w:w="90" w:type="dxa"/>
+              <w:start w:w="100" w:type="dxa"/>
+              <w:bottom w:w="90" w:type="dxa"/>
+              <w:end w:w="100" w:type="dxa"/>
+            </w:tcMar>
+          </w:tcPr>
+          <w:p>
+            <w:pPr>
+              <w:keepNext w:val="0"/>
+            </w:pPr>
+            <w:r>
+              <w:rPr>
+                <w:sz w:val="18"/>
+              </w:rPr>
+              <w:t>Student</w:t>
+            </w:r>
+          </w:p>
+        </w:tc>
+        <w:tc>
+          <w:tcPr>
+            <w:tcW w:type="dxa" w:w="4536"/>
+            <w:tcMar>
+              <w:top w:w="90" w:type="dxa"/>
+              <w:start w:w="100" w:type="dxa"/>
+              <w:bottom w:w="90" w:type="dxa"/>
+              <w:end w:w="100" w:type="dxa"/>
+            </w:tcMar>
+          </w:tcPr>
+          <w:p>
+            <w:pPr>
+              <w:keepNext w:val="0"/>
+            </w:pPr>
+            <w:r>
+              <w:rPr>
+                <w:sz w:val="18"/>
+              </w:rPr>
+              <w:t>Four-page working reference: review choices, asking or changing topics, recommendations, findings, frozen snapshots, history, and troubleshooting.</w:t>
             </w:r>
           </w:p>
         </w:tc>
@@ -6979,7 +7070,7 @@
               <w:rPr>
                 <w:sz w:val="18"/>
               </w:rPr>
-              <w:t>06 Team Setup Quickstart</w:t>
+              <w:t>05a Start Here</w:t>
             </w:r>
           </w:p>
         </w:tc>
@@ -7001,7 +7092,7 @@
               <w:rPr>
                 <w:sz w:val="18"/>
               </w:rPr>
-              <w:t>05 Student User Guide for full context</w:t>
+              <w:t>06 for repository setup; 05 for the complete student guide</w:t>
             </w:r>
           </w:p>
         </w:tc>
@@ -7050,7 +7141,7 @@
               <w:rPr>
                 <w:sz w:val="18"/>
               </w:rPr>
-              <w:t>07 Student Cheat Sheet</w:t>
+              <w:t>05a Start Here; 07 Cheat Sheet</w:t>
             </w:r>
           </w:p>
         </w:tc>
@@ -7072,7 +7163,78 @@
               <w:rPr>
                 <w:sz w:val="18"/>
               </w:rPr>
-              <w:t>05 for complete examples and review behavior</w:t>
+              <w:t>05 for examples and detailed review behavior</w:t>
+            </w:r>
+          </w:p>
+        </w:tc>
+      </w:tr>
+      <w:tr>
+        <w:trPr>
+          <w:cantSplit/>
+        </w:trPr>
+        <w:tc>
+          <w:tcPr>
+            <w:tcW w:type="dxa" w:w="3600"/>
+            <w:tcMar>
+              <w:top w:w="90" w:type="dxa"/>
+              <w:start w:w="100" w:type="dxa"/>
+              <w:bottom w:w="90" w:type="dxa"/>
+              <w:end w:w="100" w:type="dxa"/>
+            </w:tcMar>
+          </w:tcPr>
+          <w:p>
+            <w:pPr>
+              <w:keepNext w:val="0"/>
+            </w:pPr>
+            <w:r>
+              <w:rPr>
+                <w:sz w:val="18"/>
+              </w:rPr>
+              <w:t>Get feedback on an unfinished artifact (e.g., draft estimates)</w:t>
+            </w:r>
+          </w:p>
+        </w:tc>
+        <w:tc>
+          <w:tcPr>
+            <w:tcW w:type="dxa" w:w="3096"/>
+            <w:tcMar>
+              <w:top w:w="90" w:type="dxa"/>
+              <w:start w:w="100" w:type="dxa"/>
+              <w:bottom w:w="90" w:type="dxa"/>
+              <w:end w:w="100" w:type="dxa"/>
+            </w:tcMar>
+          </w:tcPr>
+          <w:p>
+            <w:pPr>
+              <w:keepNext w:val="0"/>
+            </w:pPr>
+            <w:r>
+              <w:rPr>
+                <w:sz w:val="18"/>
+              </w:rPr>
+              <w:t>05a Start Here → Focused Review</w:t>
+            </w:r>
+          </w:p>
+        </w:tc>
+        <w:tc>
+          <w:tcPr>
+            <w:tcW w:type="dxa" w:w="3312"/>
+            <w:tcMar>
+              <w:top w:w="90" w:type="dxa"/>
+              <w:start w:w="100" w:type="dxa"/>
+              <w:bottom w:w="90" w:type="dxa"/>
+              <w:end w:w="100" w:type="dxa"/>
+            </w:tcMar>
+          </w:tcPr>
+          <w:p>
+            <w:pPr>
+              <w:keepNext w:val="0"/>
+            </w:pPr>
+            <w:r>
+              <w:rPr>
+                <w:sz w:val="18"/>
+              </w:rPr>
+              <w:t>07 for a quick prompt; 05 for full workflow and evidence limits</w:t>
             </w:r>
           </w:p>
         </w:tc>
@@ -7843,7 +8005,7 @@
               <w:rPr>
                 <w:sz w:val="18"/>
               </w:rPr>
-              <w:t>05, 06, 07; possibly 04 and 00</w:t>
+              <w:t>05a, 05, 07; 06 for setup; possibly 04 and 00</w:t>
             </w:r>
           </w:p>
         </w:tc>
@@ -7941,7 +8103,7 @@
               <w:rPr>
                 <w:sz w:val="18"/>
               </w:rPr>
-              <w:t>02, 03, 04, 05, 06, 09, 11, 00</w:t>
+              <w:t>02, 03, 04, 05a, 05, 06, 09, 11, 00</w:t>
             </w:r>
           </w:p>
         </w:tc>
@@ -8203,17 +8365,17 @@
     </w:p>
     <w:p>
       <w:r>
-        <w:t>The v0.18.0 source version is defined in apps/api/app/version.py. FastAPI/OpenAPI and /health use that value. Source version, merged Git SHA, immutable image/revision, deployment success and production acceptance are separate evidence. The August GO records and v0.17 analytical history keep their original dates and versions.</w:t>
+        <w:t>The v0.18.1 source version is defined in apps/api/app/version.py; FastAPI/OpenAPI and /health use that value. Git SHA, immutable image/revision, deployment workflow, runtime health and production acceptance remain separate evidence. Historical August GO records, v0.17 analytical history and October 2 v0.18.0 acceptance retain their original dates and versions.</w:t>
       </w:r>
     </w:p>
     <w:p>
       <w:r>
-        <w:t>Accepted production uses shadow/shadow evaluation with legacy student-visible authority. Shadow validator/planner/selector/realizer evaluation remains internal and does not replace student-visible authority. This release introduces no PR5 authority transfer, database migration or course-model change.</w:t>
+        <w:t>The v0.18.1 deployment reports reasoning validation and review planning in shadow/shadow mode, with existing student-facing analytical authority unchanged. Shadow evaluation remains internal; this student-documentation update introduces no authority transfer, identity change, database migration or course-model change.</w:t>
       </w:r>
     </w:p>
     <w:p>
       <w:r>
-        <w:t>All 12 manuals (00–11) have matching DOCX and regenerated PDF editions. Manual 01 is the active leadership brief; this Master Manual is the full library front door. See docs/manuals/README.md and docs/releases/v0.18.0.md for the paired inventory and release sequence.</w:t>
+        <w:t>The library contains 12 numbered core manuals (00–11) plus one 05a Start Here companion: 13 paired DOCX/PDF entries. The three approved student documents are 05a (one-page orientation), 07 (four-page reference), and 05 (illustrated User Guide). Other manuals retain their separately tracked publication state. See docs/manuals/README.md, edition.json, and docs/releases/v0.18.1.md for inventories and release evidence.</w:t>
       </w:r>
     </w:p>
     <w:p>
@@ -9005,7 +9167,7 @@
               <w:rPr>
                 <w:sz w:val="18"/>
               </w:rPr>
-              <w:t>05, 06, 07</w:t>
+              <w:t>05a, 05, 06, 07</w:t>
             </w:r>
           </w:p>
         </w:tc>
@@ -9076,7 +9238,7 @@
               <w:rPr>
                 <w:sz w:val="18"/>
               </w:rPr>
-              <w:t>05, 06</w:t>
+              <w:t>05a, 05, 06</w:t>
             </w:r>
           </w:p>
         </w:tc>
@@ -9623,7 +9785,7 @@
         <w:t xml:space="preserve">7. </w:t>
       </w:r>
       <w:r>
-        <w:t>Give instructors 04 and students 05/06/07 before the first required use.</w:t>
+        <w:t>Give students 05a Start Here first, then 07 Cheat Sheet and 05 User Guide as needed; use 06 for team repository setup. Give instructors 04 before the first required use.</w:t>
       </w:r>
     </w:p>
     <w:p>
@@ -9734,7 +9896,7 @@
         <w:pStyle w:val="Heading1"/>
       </w:pPr>
       <w:r>
-        <w:t>Student workflow and review lifecycle — v0.18.1 candidate</w:t>
+        <w:t>Student workflow and review lifecycle — v0.18.1</w:t>
       </w:r>
     </w:p>
     <w:p>
@@ -9773,7 +9935,7 @@
     </w:p>
     <w:p>
       <w:r>
-        <w:t>Use Manual 05 for the complete student walkthrough, Manual 07 for the one-page review-cycle orientation, Manual 04 for teaching-staff support, Manual 03 for engineering boundaries, Manual 02 for administration, and Manual 09 for production release and acceptance.</w:t>
+        <w:t>Give new students Manual 05a first (one-page Start Here). Manual 07 is the four-page working Cheat Sheet; Manual 05 contains the complete illustrated task-based walkthrough; Manual 06 covers repository setup. Use Manual 04 for teaching-staff support, 03 for architecture, 02 for administration, and 09 for production operations.</w:t>
       </w:r>
     </w:p>
     <w:p>
@@ -9786,7 +9948,7 @@
     </w:p>
     <w:p>
       <w:r>
-        <w:t>This is a source candidate: functional simulation is not proof of Azure production operation, actual GitHub synchronization, live reviewer quality, screen-reader acceptance, or independent student comprehension. The October 2 v0.18.0 production record is historical and unchanged.</w:t>
+        <w:t>Operational evidence: GitHub deployment for merged v0.18.1 completed, /health reported version 0.18.1 with shadow/shadow modes, /ready reported connected/current migrations, and authenticated student UI navigation was smoke-tested. These checks do not establish independent uncoached student comprehension, screen-reader acceptance, or comprehensive live reviewer quality; track those separately. Historical v0.18.0 production records remain unchanged.</w:t>
       </w:r>
     </w:p>
     <w:sectPr>

</xml_diff>